<commit_message>
added correcr resume template with proper placeholders
</commit_message>
<xml_diff>
--- a/templates/resume_template.docx
+++ b/templates/resume_template.docx
@@ -7,70 +7,174 @@
         <w:pStyle w:val="Heading1"/>
         <w:keepNext w:val="0"/>
         <w:keepLines w:val="0"/>
-        <w:spacing w:before="480" w:after="40" w:line="240" w:lineRule="auto"/>
+        <w:suppressLineNumbers w:val="0"/>
+        <w:bidi w:val="0"/>
+        <w:spacing w:before="480" w:beforeAutospacing="off" w:after="40" w:afterAutospacing="off" w:line="240" w:lineRule="auto"/>
+        <w:ind w:left="0" w:right="0"/>
         <w:jc w:val="center"/>
         <w:rPr>
-          <w:rFonts w:ascii="Calibri" w:eastAsia="Calibri" w:hAnsi="Calibri" w:cs="Calibri"/>
-          <w:b/>
-          <w:bCs/>
+          <w:rFonts w:ascii="Calibri" w:hAnsi="Calibri" w:eastAsia="Calibri" w:cs="Calibri"/>
+          <w:b w:val="1"/>
+          <w:bCs w:val="1"/>
           <w:sz w:val="32"/>
           <w:szCs w:val="32"/>
         </w:rPr>
       </w:pPr>
       <w:r>
         <w:rPr>
-          <w:rFonts w:ascii="Calibri" w:eastAsia="Calibri" w:hAnsi="Calibri" w:cs="Calibri"/>
-          <w:b/>
-          <w:bCs/>
+          <w:rFonts w:ascii="Calibri" w:hAnsi="Calibri" w:eastAsia="Calibri" w:cs="Calibri"/>
+          <w:b w:val="1"/>
+          <w:bCs w:val="1"/>
           <w:sz w:val="32"/>
           <w:szCs w:val="32"/>
         </w:rPr>
-        <w:t>{{Name}}</w:t>
-      </w:r>
-    </w:p>
-    <w:p>
-      <w:pPr>
-        <w:spacing w:after="160" w:line="240" w:lineRule="auto"/>
+        <w:t>{</w:t>
+      </w:r>
+      <w:r>
+        <w:rPr>
+          <w:rFonts w:ascii="Calibri" w:hAnsi="Calibri" w:eastAsia="Calibri" w:cs="Calibri"/>
+          <w:b w:val="1"/>
+          <w:bCs w:val="1"/>
+          <w:sz w:val="32"/>
+          <w:szCs w:val="32"/>
+        </w:rPr>
+        <w:t>NAME</w:t>
+      </w:r>
+      <w:r>
+        <w:rPr>
+          <w:rFonts w:ascii="Calibri" w:hAnsi="Calibri" w:eastAsia="Calibri" w:cs="Calibri"/>
+          <w:b w:val="1"/>
+          <w:bCs w:val="1"/>
+          <w:sz w:val="32"/>
+          <w:szCs w:val="32"/>
+        </w:rPr>
+        <w:t>}</w:t>
+      </w:r>
+    </w:p>
+    <w:p>
+      <w:pPr>
+        <w:pStyle w:val="Normal"/>
+        <w:suppressLineNumbers w:val="0"/>
+        <w:bidi w:val="0"/>
+        <w:spacing w:before="0" w:beforeAutospacing="off" w:after="160" w:afterAutospacing="off" w:line="240" w:lineRule="auto"/>
+        <w:ind w:left="0" w:right="0"/>
         <w:jc w:val="center"/>
         <w:rPr>
-          <w:rFonts w:ascii="Calibri" w:eastAsia="Calibri" w:hAnsi="Calibri" w:cs="Calibri"/>
-          <w:color w:val="333333"/>
-        </w:rPr>
-      </w:pPr>
-      <w:r>
-        <w:rPr>
-          <w:rFonts w:ascii="Calibri" w:eastAsia="Calibri" w:hAnsi="Calibri" w:cs="Calibri"/>
-          <w:color w:val="333333"/>
-        </w:rPr>
-        <w:t>{{</w:t>
-      </w:r>
-      <w:r>
-        <w:rPr>
-          <w:rFonts w:ascii="Calibri" w:eastAsia="Calibri" w:hAnsi="Calibri" w:cs="Calibri"/>
-          <w:color w:val="333333"/>
-        </w:rPr>
-        <w:t>City</w:t>
-      </w:r>
-      <w:r>
-        <w:rPr>
-          <w:rFonts w:ascii="Calibri" w:eastAsia="Calibri" w:hAnsi="Calibri" w:cs="Calibri"/>
-          <w:color w:val="333333"/>
-        </w:rPr>
-        <w:t>}}, {{Country}}</w:t>
-      </w:r>
-      <w:r>
-        <w:rPr>
-          <w:rFonts w:ascii="Calibri" w:eastAsia="Calibri" w:hAnsi="Calibri" w:cs="Calibri"/>
+          <w:rFonts w:ascii="Calibri" w:hAnsi="Calibri" w:eastAsia="Calibri" w:cs="Calibri"/>
+          <w:color w:val="333333"/>
+        </w:rPr>
+      </w:pPr>
+      <w:r>
+        <w:rPr>
+          <w:rFonts w:ascii="Calibri" w:hAnsi="Calibri" w:eastAsia="Calibri" w:cs="Calibri"/>
+          <w:color w:val="333333"/>
+        </w:rPr>
+        <w:t>{</w:t>
+      </w:r>
+      <w:r>
+        <w:rPr>
+          <w:rFonts w:ascii="Calibri" w:hAnsi="Calibri" w:eastAsia="Calibri" w:cs="Calibri"/>
+          <w:color w:val="333333"/>
+        </w:rPr>
+        <w:t>CITY</w:t>
+      </w:r>
+      <w:r>
+        <w:rPr>
+          <w:rFonts w:ascii="Calibri" w:hAnsi="Calibri" w:eastAsia="Calibri" w:cs="Calibri"/>
+          <w:color w:val="333333"/>
+        </w:rPr>
+        <w:t>}</w:t>
+      </w:r>
+      <w:r>
+        <w:rPr>
+          <w:rFonts w:ascii="Calibri" w:hAnsi="Calibri" w:eastAsia="Calibri" w:cs="Calibri"/>
+          <w:color w:val="333333"/>
+        </w:rPr>
+        <w:t xml:space="preserve">, </w:t>
+      </w:r>
+      <w:r>
+        <w:rPr>
+          <w:rFonts w:ascii="Calibri" w:hAnsi="Calibri" w:eastAsia="Calibri" w:cs="Calibri"/>
+          <w:color w:val="333333"/>
+        </w:rPr>
+        <w:t>{</w:t>
+      </w:r>
+      <w:r>
+        <w:rPr>
+          <w:rFonts w:ascii="Calibri" w:hAnsi="Calibri" w:eastAsia="Calibri" w:cs="Calibri"/>
+          <w:color w:val="333333"/>
+        </w:rPr>
+        <w:t>COUNTRY</w:t>
+      </w:r>
+      <w:r>
+        <w:rPr>
+          <w:rFonts w:ascii="Calibri" w:hAnsi="Calibri" w:eastAsia="Calibri" w:cs="Calibri"/>
+          <w:color w:val="333333"/>
+        </w:rPr>
+        <w:t>}</w:t>
+      </w:r>
+      <w:r>
+        <w:rPr>
+          <w:rFonts w:ascii="Calibri" w:hAnsi="Calibri" w:eastAsia="Calibri" w:cs="Calibri"/>
           <w:color w:val="333333"/>
         </w:rPr>
         <w:t xml:space="preserve"> </w:t>
       </w:r>
       <w:r>
         <w:rPr>
-          <w:rFonts w:ascii="Calibri" w:eastAsia="Calibri" w:hAnsi="Calibri" w:cs="Calibri"/>
-          <w:color w:val="333333"/>
-        </w:rPr>
-        <w:t>| {{Phone}} | {{email}}</w:t>
+          <w:rFonts w:ascii="Calibri" w:hAnsi="Calibri" w:eastAsia="Calibri" w:cs="Calibri"/>
+          <w:color w:val="333333"/>
+        </w:rPr>
+        <w:t xml:space="preserve">| </w:t>
+      </w:r>
+      <w:r>
+        <w:rPr>
+          <w:rFonts w:ascii="Calibri" w:hAnsi="Calibri" w:eastAsia="Calibri" w:cs="Calibri"/>
+          <w:color w:val="333333"/>
+        </w:rPr>
+        <w:t>{</w:t>
+      </w:r>
+      <w:r>
+        <w:rPr>
+          <w:rFonts w:ascii="Calibri" w:hAnsi="Calibri" w:eastAsia="Calibri" w:cs="Calibri"/>
+          <w:color w:val="333333"/>
+        </w:rPr>
+        <w:t>PHONE</w:t>
+      </w:r>
+      <w:r>
+        <w:rPr>
+          <w:rFonts w:ascii="Calibri" w:hAnsi="Calibri" w:eastAsia="Calibri" w:cs="Calibri"/>
+          <w:color w:val="333333"/>
+        </w:rPr>
+        <w:t>}</w:t>
+      </w:r>
+      <w:r>
+        <w:rPr>
+          <w:rFonts w:ascii="Calibri" w:hAnsi="Calibri" w:eastAsia="Calibri" w:cs="Calibri"/>
+          <w:color w:val="333333"/>
+        </w:rPr>
+        <w:t xml:space="preserve"> | </w:t>
+      </w:r>
+      <w:r>
+        <w:rPr>
+          <w:rFonts w:ascii="Calibri" w:hAnsi="Calibri" w:eastAsia="Calibri" w:cs="Calibri"/>
+          <w:color w:val="333333"/>
+        </w:rPr>
+        <w:t>{</w:t>
+      </w:r>
+      <w:r>
+        <w:rPr>
+          <w:rFonts w:ascii="Calibri" w:hAnsi="Calibri" w:eastAsia="Calibri" w:cs="Calibri"/>
+          <w:color w:val="333333"/>
+        </w:rPr>
+        <w:t>EMAIL</w:t>
+      </w:r>
+      <w:r>
+        <w:rPr>
+          <w:rFonts w:ascii="Calibri" w:hAnsi="Calibri" w:eastAsia="Calibri" w:cs="Calibri"/>
+          <w:color w:val="333333"/>
+        </w:rPr>
+        <w:t>}</w:t>
       </w:r>
     </w:p>
     <w:p>
@@ -79,22 +183,22 @@
         <w:keepNext w:val="0"/>
         <w:keepLines w:val="0"/>
         <w:pBdr>
-          <w:bottom w:val="single" w:sz="6" w:space="2" w:color="000000"/>
+          <w:bottom w:val="single" w:color="000000" w:sz="6" w:space="2"/>
         </w:pBdr>
         <w:spacing w:before="220" w:after="80" w:line="240" w:lineRule="auto"/>
         <w:rPr>
-          <w:rFonts w:ascii="Calibri" w:eastAsia="Calibri" w:hAnsi="Calibri" w:cs="Calibri"/>
+          <w:rFonts w:ascii="Calibri" w:hAnsi="Calibri" w:eastAsia="Calibri" w:cs="Calibri"/>
           <w:b/>
           <w:bCs/>
           <w:sz w:val="22"/>
           <w:szCs w:val="22"/>
         </w:rPr>
       </w:pPr>
-      <w:bookmarkStart w:id="0" w:name="_kv7a8drzhl8i" w:colFirst="0" w:colLast="0"/>
+      <w:bookmarkStart w:name="_kv7a8drzhl8i" w:colFirst="0" w:colLast="0" w:id="0"/>
       <w:bookmarkEnd w:id="0"/>
       <w:r>
         <w:rPr>
-          <w:rFonts w:ascii="Calibri" w:eastAsia="Calibri" w:hAnsi="Calibri" w:cs="Calibri"/>
+          <w:rFonts w:ascii="Calibri" w:hAnsi="Calibri" w:eastAsia="Calibri" w:cs="Calibri"/>
           <w:b/>
           <w:bCs/>
           <w:sz w:val="22"/>
@@ -107,30 +211,30 @@
       <w:pPr>
         <w:spacing w:before="180" w:after="180" w:line="240" w:lineRule="auto"/>
         <w:rPr>
-          <w:rFonts w:ascii="Calibri" w:eastAsia="Calibri" w:hAnsi="Calibri" w:cs="Calibri"/>
-          <w:color w:val="333333"/>
-        </w:rPr>
-      </w:pPr>
-      <w:r>
-        <w:rPr>
-          <w:rFonts w:ascii="Calibri" w:eastAsia="Calibri" w:hAnsi="Calibri" w:cs="Calibri"/>
-          <w:color w:val="333333"/>
-        </w:rPr>
-        <w:t>{{</w:t>
-      </w:r>
-      <w:r>
-        <w:rPr>
-          <w:rFonts w:ascii="Calibri" w:eastAsia="Calibri" w:hAnsi="Calibri" w:cs="Calibri"/>
+          <w:rFonts w:ascii="Calibri" w:hAnsi="Calibri" w:eastAsia="Calibri" w:cs="Calibri"/>
+          <w:color w:val="333333"/>
+        </w:rPr>
+      </w:pPr>
+      <w:r>
+        <w:rPr>
+          <w:rFonts w:ascii="Calibri" w:hAnsi="Calibri" w:eastAsia="Calibri" w:cs="Calibri"/>
+          <w:color w:val="333333"/>
+        </w:rPr>
+        <w:t>{</w:t>
+      </w:r>
+      <w:r>
+        <w:rPr>
+          <w:rFonts w:ascii="Calibri" w:hAnsi="Calibri" w:eastAsia="Calibri" w:cs="Calibri"/>
           <w:color w:val="333333"/>
         </w:rPr>
         <w:t>SUMMARY</w:t>
       </w:r>
       <w:r>
         <w:rPr>
-          <w:rFonts w:ascii="Calibri" w:eastAsia="Calibri" w:hAnsi="Calibri" w:cs="Calibri"/>
-          <w:color w:val="333333"/>
-        </w:rPr>
-        <w:t>}}</w:t>
+          <w:rFonts w:ascii="Calibri" w:hAnsi="Calibri" w:eastAsia="Calibri" w:cs="Calibri"/>
+          <w:color w:val="333333"/>
+        </w:rPr>
+        <w:t>}</w:t>
       </w:r>
     </w:p>
     <w:p>
@@ -139,22 +243,22 @@
         <w:keepNext w:val="0"/>
         <w:keepLines w:val="0"/>
         <w:pBdr>
-          <w:bottom w:val="single" w:sz="6" w:space="2" w:color="000000"/>
+          <w:bottom w:val="single" w:color="000000" w:sz="6" w:space="2"/>
         </w:pBdr>
         <w:spacing w:before="220" w:after="80" w:line="240" w:lineRule="auto"/>
         <w:rPr>
-          <w:rFonts w:ascii="Calibri" w:eastAsia="Calibri" w:hAnsi="Calibri" w:cs="Calibri"/>
+          <w:rFonts w:ascii="Calibri" w:hAnsi="Calibri" w:eastAsia="Calibri" w:cs="Calibri"/>
           <w:b/>
           <w:bCs/>
           <w:sz w:val="22"/>
           <w:szCs w:val="22"/>
         </w:rPr>
       </w:pPr>
-      <w:bookmarkStart w:id="1" w:name="_jmperqwyu0q5" w:colFirst="0" w:colLast="0"/>
+      <w:bookmarkStart w:name="_jmperqwyu0q5" w:colFirst="0" w:colLast="0" w:id="1"/>
       <w:bookmarkEnd w:id="1"/>
       <w:r>
         <w:rPr>
-          <w:rFonts w:ascii="Calibri" w:eastAsia="Calibri" w:hAnsi="Calibri" w:cs="Calibri"/>
+          <w:rFonts w:ascii="Calibri" w:hAnsi="Calibri" w:eastAsia="Calibri" w:cs="Calibri"/>
           <w:b/>
           <w:bCs/>
           <w:sz w:val="22"/>
@@ -167,7 +271,7 @@
       <w:pPr>
         <w:spacing w:after="20"/>
         <w:rPr>
-          <w:rFonts w:ascii="Calibri" w:eastAsia="Calibri" w:hAnsi="Calibri" w:cs="Calibri"/>
+          <w:rFonts w:ascii="Calibri" w:hAnsi="Calibri" w:eastAsia="Calibri" w:cs="Calibri"/>
           <w:b/>
           <w:bCs/>
           <w:color w:val="333333"/>
@@ -175,7 +279,7 @@
       </w:pPr>
       <w:r>
         <w:rPr>
-          <w:rFonts w:ascii="Calibri" w:eastAsia="Calibri" w:hAnsi="Calibri" w:cs="Calibri"/>
+          <w:rFonts w:ascii="Calibri" w:hAnsi="Calibri" w:eastAsia="Calibri" w:cs="Calibri"/>
           <w:b/>
           <w:bCs/>
           <w:color w:val="333333"/>
@@ -187,13 +291,13 @@
       <w:pPr>
         <w:spacing w:after="20"/>
         <w:rPr>
-          <w:rFonts w:ascii="Calibri" w:eastAsia="Calibri" w:hAnsi="Calibri" w:cs="Calibri"/>
-          <w:color w:val="333333"/>
-        </w:rPr>
-      </w:pPr>
-      <w:r>
-        <w:rPr>
-          <w:rFonts w:ascii="Calibri" w:eastAsia="Calibri" w:hAnsi="Calibri" w:cs="Calibri"/>
+          <w:rFonts w:ascii="Calibri" w:hAnsi="Calibri" w:eastAsia="Calibri" w:cs="Calibri"/>
+          <w:color w:val="333333"/>
+        </w:rPr>
+      </w:pPr>
+      <w:r>
+        <w:rPr>
+          <w:rFonts w:ascii="Calibri" w:hAnsi="Calibri" w:eastAsia="Calibri" w:cs="Calibri"/>
           <w:color w:val="333333"/>
         </w:rPr>
         <w:t>May 2024 – Present</w:t>
@@ -206,16 +310,30 @@
           <w:numId w:val="2"/>
         </w:numPr>
         <w:rPr>
-          <w:rFonts w:ascii="Calibri" w:eastAsia="Calibri" w:hAnsi="Calibri" w:cs="Calibri"/>
-          <w:color w:val="333333"/>
-        </w:rPr>
-      </w:pPr>
-      <w:r>
-        <w:rPr>
-          <w:rFonts w:ascii="Calibri" w:eastAsia="Calibri" w:hAnsi="Calibri" w:cs="Calibri"/>
-          <w:color w:val="333333"/>
-        </w:rPr>
-        <w:t>{{TURING_BULLET_1}}</w:t>
+          <w:rFonts w:ascii="Calibri" w:hAnsi="Calibri" w:eastAsia="Calibri" w:cs="Calibri"/>
+          <w:color w:val="333333"/>
+        </w:rPr>
+      </w:pPr>
+      <w:r>
+        <w:rPr>
+          <w:rFonts w:ascii="Calibri" w:hAnsi="Calibri" w:eastAsia="Calibri" w:cs="Calibri"/>
+          <w:color w:val="333333"/>
+        </w:rPr>
+        <w:t>{</w:t>
+      </w:r>
+      <w:r>
+        <w:rPr>
+          <w:rFonts w:ascii="Calibri" w:hAnsi="Calibri" w:eastAsia="Calibri" w:cs="Calibri"/>
+          <w:color w:val="333333"/>
+        </w:rPr>
+        <w:t>TURING_BULLET_1</w:t>
+      </w:r>
+      <w:r>
+        <w:rPr>
+          <w:rFonts w:ascii="Calibri" w:hAnsi="Calibri" w:eastAsia="Calibri" w:cs="Calibri"/>
+          <w:color w:val="333333"/>
+        </w:rPr>
+        <w:t>}</w:t>
       </w:r>
     </w:p>
     <w:p>
@@ -225,23 +343,30 @@
           <w:numId w:val="2"/>
         </w:numPr>
         <w:rPr>
-          <w:rFonts w:ascii="Calibri" w:eastAsia="Calibri" w:hAnsi="Calibri" w:cs="Calibri"/>
-          <w:color w:val="333333"/>
-        </w:rPr>
-      </w:pPr>
-      <w:r>
-        <w:rPr>
-          <w:rFonts w:ascii="Calibri" w:eastAsia="Calibri" w:hAnsi="Calibri" w:cs="Calibri"/>
-          <w:color w:val="333333"/>
-        </w:rPr>
-        <w:t>{{TURING_BULLET_2</w:t>
-      </w:r>
-      <w:r>
-        <w:rPr>
-          <w:rFonts w:ascii="Calibri" w:eastAsia="Calibri" w:hAnsi="Calibri" w:cs="Calibri"/>
-          <w:color w:val="333333"/>
-        </w:rPr>
-        <w:t>}}</w:t>
+          <w:rFonts w:ascii="Calibri" w:hAnsi="Calibri" w:eastAsia="Calibri" w:cs="Calibri"/>
+          <w:color w:val="333333"/>
+        </w:rPr>
+      </w:pPr>
+      <w:r>
+        <w:rPr>
+          <w:rFonts w:ascii="Calibri" w:hAnsi="Calibri" w:eastAsia="Calibri" w:cs="Calibri"/>
+          <w:color w:val="333333"/>
+        </w:rPr>
+        <w:t>{</w:t>
+      </w:r>
+      <w:r>
+        <w:rPr>
+          <w:rFonts w:ascii="Calibri" w:hAnsi="Calibri" w:eastAsia="Calibri" w:cs="Calibri"/>
+          <w:color w:val="333333"/>
+        </w:rPr>
+        <w:t>TURING_BULLET_2</w:t>
+      </w:r>
+      <w:r>
+        <w:rPr>
+          <w:rFonts w:ascii="Calibri" w:hAnsi="Calibri" w:eastAsia="Calibri" w:cs="Calibri"/>
+          <w:color w:val="333333"/>
+        </w:rPr>
+        <w:t>}</w:t>
       </w:r>
     </w:p>
     <w:p>
@@ -251,23 +376,30 @@
           <w:numId w:val="2"/>
         </w:numPr>
         <w:rPr>
-          <w:rFonts w:ascii="Calibri" w:eastAsia="Calibri" w:hAnsi="Calibri" w:cs="Calibri"/>
-          <w:color w:val="333333"/>
-        </w:rPr>
-      </w:pPr>
-      <w:r>
-        <w:rPr>
-          <w:rFonts w:ascii="Calibri" w:eastAsia="Calibri" w:hAnsi="Calibri" w:cs="Calibri"/>
-          <w:color w:val="333333"/>
-        </w:rPr>
-        <w:t>{{TURING_BULLET_3</w:t>
-      </w:r>
-      <w:r>
-        <w:rPr>
-          <w:rFonts w:ascii="Calibri" w:eastAsia="Calibri" w:hAnsi="Calibri" w:cs="Calibri"/>
-          <w:color w:val="333333"/>
-        </w:rPr>
-        <w:t>}}</w:t>
+          <w:rFonts w:ascii="Calibri" w:hAnsi="Calibri" w:eastAsia="Calibri" w:cs="Calibri"/>
+          <w:color w:val="333333"/>
+        </w:rPr>
+      </w:pPr>
+      <w:r>
+        <w:rPr>
+          <w:rFonts w:ascii="Calibri" w:hAnsi="Calibri" w:eastAsia="Calibri" w:cs="Calibri"/>
+          <w:color w:val="333333"/>
+        </w:rPr>
+        <w:t>{</w:t>
+      </w:r>
+      <w:r>
+        <w:rPr>
+          <w:rFonts w:ascii="Calibri" w:hAnsi="Calibri" w:eastAsia="Calibri" w:cs="Calibri"/>
+          <w:color w:val="333333"/>
+        </w:rPr>
+        <w:t>TURING_BULLET_3</w:t>
+      </w:r>
+      <w:r>
+        <w:rPr>
+          <w:rFonts w:ascii="Calibri" w:hAnsi="Calibri" w:eastAsia="Calibri" w:cs="Calibri"/>
+          <w:color w:val="333333"/>
+        </w:rPr>
+        <w:t>}</w:t>
       </w:r>
     </w:p>
     <w:p>
@@ -277,69 +409,77 @@
           <w:numId w:val="2"/>
         </w:numPr>
         <w:rPr>
-          <w:rFonts w:ascii="Calibri" w:eastAsia="Calibri" w:hAnsi="Calibri" w:cs="Calibri"/>
-          <w:color w:val="333333"/>
-        </w:rPr>
-      </w:pPr>
-      <w:r>
-        <w:rPr>
-          <w:rFonts w:ascii="Calibri" w:eastAsia="Calibri" w:hAnsi="Calibri" w:cs="Calibri"/>
-          <w:color w:val="333333"/>
-        </w:rPr>
-        <w:t>{{TURING_BULLET_4</w:t>
-      </w:r>
-      <w:r>
-        <w:rPr>
-          <w:rFonts w:ascii="Calibri" w:eastAsia="Calibri" w:hAnsi="Calibri" w:cs="Calibri"/>
-          <w:color w:val="333333"/>
-        </w:rPr>
-        <w:t>}}</w:t>
+          <w:rFonts w:ascii="Calibri" w:hAnsi="Calibri" w:eastAsia="Calibri" w:cs="Calibri"/>
+          <w:color w:val="333333"/>
+        </w:rPr>
+      </w:pPr>
+      <w:r>
+        <w:rPr>
+          <w:rFonts w:ascii="Calibri" w:hAnsi="Calibri" w:eastAsia="Calibri" w:cs="Calibri"/>
+          <w:color w:val="333333"/>
+        </w:rPr>
+        <w:t>{</w:t>
+      </w:r>
+      <w:r>
+        <w:rPr>
+          <w:rFonts w:ascii="Calibri" w:hAnsi="Calibri" w:eastAsia="Calibri" w:cs="Calibri"/>
+          <w:color w:val="333333"/>
+        </w:rPr>
+        <w:t>TURING_BULLET_4</w:t>
+      </w:r>
+      <w:r>
+        <w:rPr>
+          <w:rFonts w:ascii="Calibri" w:hAnsi="Calibri" w:eastAsia="Calibri" w:cs="Calibri"/>
+          <w:color w:val="333333"/>
+        </w:rPr>
+        <w:t>}</w:t>
       </w:r>
     </w:p>
     <w:p>
       <w:pPr>
         <w:spacing w:after="20"/>
         <w:rPr>
-          <w:rFonts w:ascii="Calibri" w:eastAsia="Calibri" w:hAnsi="Calibri" w:cs="Calibri"/>
-          <w:b/>
-          <w:bCs/>
-          <w:color w:val="333333"/>
-        </w:rPr>
-      </w:pPr>
-      <w:r>
-        <w:rPr>
-          <w:rFonts w:ascii="Calibri" w:eastAsia="Calibri" w:hAnsi="Calibri" w:cs="Calibri"/>
-          <w:b/>
-          <w:bCs/>
-          <w:color w:val="333333"/>
+          <w:rFonts w:ascii="Calibri" w:hAnsi="Calibri" w:eastAsia="Calibri" w:cs="Calibri"/>
+          <w:b w:val="1"/>
+          <w:bCs w:val="1"/>
+          <w:color w:val="333333"/>
+          <w:lang w:val="en-US"/>
+        </w:rPr>
+      </w:pPr>
+      <w:r>
+        <w:rPr>
+          <w:rFonts w:ascii="Calibri" w:hAnsi="Calibri" w:eastAsia="Calibri" w:cs="Calibri"/>
+          <w:b w:val="1"/>
+          <w:bCs w:val="1"/>
+          <w:color w:val="333333"/>
+          <w:lang w:val="en-US"/>
         </w:rPr>
         <w:t xml:space="preserve">Software engineer | </w:t>
       </w:r>
-      <w:proofErr w:type="spellStart"/>
-      <w:r>
-        <w:rPr>
-          <w:rFonts w:ascii="Calibri" w:eastAsia="Calibri" w:hAnsi="Calibri" w:cs="Calibri"/>
-          <w:b/>
-          <w:bCs/>
-          <w:color w:val="333333"/>
+      <w:r>
+        <w:rPr>
+          <w:rFonts w:ascii="Calibri" w:hAnsi="Calibri" w:eastAsia="Calibri" w:cs="Calibri"/>
+          <w:b w:val="1"/>
+          <w:bCs w:val="1"/>
+          <w:color w:val="333333"/>
+          <w:lang w:val="en-US"/>
         </w:rPr>
         <w:t>Afiniti</w:t>
       </w:r>
-      <w:bookmarkStart w:id="2" w:name="_GoBack"/>
+      <w:bookmarkStart w:name="_GoBack" w:id="2"/>
       <w:bookmarkEnd w:id="2"/>
-      <w:proofErr w:type="spellEnd"/>
     </w:p>
     <w:p>
       <w:pPr>
         <w:spacing w:after="20"/>
         <w:rPr>
-          <w:rFonts w:ascii="Calibri" w:eastAsia="Calibri" w:hAnsi="Calibri" w:cs="Calibri"/>
-          <w:color w:val="333333"/>
-        </w:rPr>
-      </w:pPr>
-      <w:r>
-        <w:rPr>
-          <w:rFonts w:ascii="Calibri" w:eastAsia="Calibri" w:hAnsi="Calibri" w:cs="Calibri"/>
+          <w:rFonts w:ascii="Calibri" w:hAnsi="Calibri" w:eastAsia="Calibri" w:cs="Calibri"/>
+          <w:color w:val="333333"/>
+        </w:rPr>
+      </w:pPr>
+      <w:r>
+        <w:rPr>
+          <w:rFonts w:ascii="Calibri" w:hAnsi="Calibri" w:eastAsia="Calibri" w:cs="Calibri"/>
           <w:color w:val="333333"/>
         </w:rPr>
         <w:t>Nov 2022 – June 2024</w:t>
@@ -352,32 +492,37 @@
           <w:numId w:val="5"/>
         </w:numPr>
         <w:rPr>
-          <w:rFonts w:ascii="Calibri" w:eastAsia="Calibri" w:hAnsi="Calibri" w:cs="Calibri"/>
-          <w:color w:val="333333"/>
-        </w:rPr>
-      </w:pPr>
-      <w:r>
-        <w:rPr>
-          <w:rFonts w:ascii="Calibri" w:eastAsia="Calibri" w:hAnsi="Calibri" w:cs="Calibri"/>
-          <w:color w:val="333333"/>
-        </w:rPr>
-        <w:t xml:space="preserve">Worked on two services inside a telephony switch using </w:t>
-      </w:r>
-      <w:proofErr w:type="spellStart"/>
-      <w:r>
-        <w:rPr>
-          <w:rFonts w:ascii="Calibri" w:eastAsia="Calibri" w:hAnsi="Calibri" w:cs="Calibri"/>
-          <w:color w:val="333333"/>
-        </w:rPr>
-        <w:t>TypeScript</w:t>
-      </w:r>
-      <w:proofErr w:type="spellEnd"/>
-      <w:r>
-        <w:rPr>
-          <w:rFonts w:ascii="Calibri" w:eastAsia="Calibri" w:hAnsi="Calibri" w:cs="Calibri"/>
-          <w:color w:val="333333"/>
-        </w:rPr>
-        <w:t xml:space="preserve">, Nest.js, and Node.js. </w:t>
+          <w:rFonts w:ascii="Calibri" w:hAnsi="Calibri" w:eastAsia="Calibri" w:cs="Calibri"/>
+          <w:color w:val="333333"/>
+        </w:rPr>
+      </w:pPr>
+      <w:r>
+        <w:rPr>
+          <w:rFonts w:ascii="Calibri" w:hAnsi="Calibri" w:eastAsia="Calibri" w:cs="Calibri"/>
+          <w:color w:val="333333"/>
+        </w:rPr>
+        <w:t>{</w:t>
+      </w:r>
+      <w:r>
+        <w:rPr>
+          <w:rFonts w:ascii="Calibri" w:hAnsi="Calibri" w:eastAsia="Calibri" w:cs="Calibri"/>
+          <w:color w:val="333333"/>
+        </w:rPr>
+        <w:t>AFINITI</w:t>
+      </w:r>
+      <w:r>
+        <w:rPr>
+          <w:rFonts w:ascii="Calibri" w:hAnsi="Calibri" w:eastAsia="Calibri" w:cs="Calibri"/>
+          <w:color w:val="333333"/>
+        </w:rPr>
+        <w:t>_BULLET_1</w:t>
+      </w:r>
+      <w:r>
+        <w:rPr>
+          <w:rFonts w:ascii="Calibri" w:hAnsi="Calibri" w:eastAsia="Calibri" w:cs="Calibri"/>
+          <w:color w:val="333333"/>
+        </w:rPr>
+        <w:t>}</w:t>
       </w:r>
     </w:p>
     <w:p>
@@ -387,30 +532,37 @@
           <w:numId w:val="5"/>
         </w:numPr>
         <w:rPr>
-          <w:rFonts w:ascii="Calibri" w:eastAsia="Calibri" w:hAnsi="Calibri" w:cs="Calibri"/>
-          <w:color w:val="333333"/>
-        </w:rPr>
-      </w:pPr>
-      <w:r>
-        <w:rPr>
-          <w:rFonts w:ascii="Calibri" w:eastAsia="Calibri" w:hAnsi="Calibri" w:cs="Calibri"/>
-          <w:color w:val="333333"/>
-        </w:rPr>
-        <w:t>{{</w:t>
-      </w:r>
-      <w:r>
-        <w:rPr>
-          <w:rFonts w:ascii="Calibri" w:eastAsia="Calibri" w:hAnsi="Calibri" w:cs="Calibri"/>
+          <w:rFonts w:ascii="Calibri" w:hAnsi="Calibri" w:eastAsia="Calibri" w:cs="Calibri"/>
+          <w:color w:val="333333"/>
+        </w:rPr>
+      </w:pPr>
+      <w:r>
+        <w:rPr>
+          <w:rFonts w:ascii="Calibri" w:hAnsi="Calibri" w:eastAsia="Calibri" w:cs="Calibri"/>
+          <w:color w:val="333333"/>
+        </w:rPr>
+        <w:t>{</w:t>
+      </w:r>
+      <w:r>
+        <w:rPr>
+          <w:rFonts w:ascii="Calibri" w:hAnsi="Calibri" w:eastAsia="Calibri" w:cs="Calibri"/>
           <w:color w:val="333333"/>
         </w:rPr>
         <w:t>AFINITI</w:t>
       </w:r>
       <w:r>
         <w:rPr>
-          <w:rFonts w:ascii="Calibri" w:eastAsia="Calibri" w:hAnsi="Calibri" w:cs="Calibri"/>
-          <w:color w:val="333333"/>
-        </w:rPr>
-        <w:t>_BULLET_1}}</w:t>
+          <w:rFonts w:ascii="Calibri" w:hAnsi="Calibri" w:eastAsia="Calibri" w:cs="Calibri"/>
+          <w:color w:val="333333"/>
+        </w:rPr>
+        <w:t>_BULLET_2</w:t>
+      </w:r>
+      <w:r>
+        <w:rPr>
+          <w:rFonts w:ascii="Calibri" w:hAnsi="Calibri" w:eastAsia="Calibri" w:cs="Calibri"/>
+          <w:color w:val="333333"/>
+        </w:rPr>
+        <w:t>}</w:t>
       </w:r>
     </w:p>
     <w:p>
@@ -420,37 +572,37 @@
           <w:numId w:val="5"/>
         </w:numPr>
         <w:rPr>
-          <w:rFonts w:ascii="Calibri" w:eastAsia="Calibri" w:hAnsi="Calibri" w:cs="Calibri"/>
-          <w:color w:val="333333"/>
-        </w:rPr>
-      </w:pPr>
-      <w:r>
-        <w:rPr>
-          <w:rFonts w:ascii="Calibri" w:eastAsia="Calibri" w:hAnsi="Calibri" w:cs="Calibri"/>
-          <w:color w:val="333333"/>
-        </w:rPr>
-        <w:t>{{</w:t>
-      </w:r>
-      <w:r>
-        <w:rPr>
-          <w:rFonts w:ascii="Calibri" w:eastAsia="Calibri" w:hAnsi="Calibri" w:cs="Calibri"/>
+          <w:rFonts w:ascii="Calibri" w:hAnsi="Calibri" w:eastAsia="Calibri" w:cs="Calibri"/>
+          <w:color w:val="333333"/>
+        </w:rPr>
+      </w:pPr>
+      <w:r>
+        <w:rPr>
+          <w:rFonts w:ascii="Calibri" w:hAnsi="Calibri" w:eastAsia="Calibri" w:cs="Calibri"/>
+          <w:color w:val="333333"/>
+        </w:rPr>
+        <w:t>{</w:t>
+      </w:r>
+      <w:r>
+        <w:rPr>
+          <w:rFonts w:ascii="Calibri" w:hAnsi="Calibri" w:eastAsia="Calibri" w:cs="Calibri"/>
           <w:color w:val="333333"/>
         </w:rPr>
         <w:t>AFINITI</w:t>
       </w:r>
       <w:r>
         <w:rPr>
-          <w:rFonts w:ascii="Calibri" w:eastAsia="Calibri" w:hAnsi="Calibri" w:cs="Calibri"/>
-          <w:color w:val="333333"/>
-        </w:rPr>
-        <w:t xml:space="preserve"> _BULLET_2</w:t>
-      </w:r>
-      <w:r>
-        <w:rPr>
-          <w:rFonts w:ascii="Calibri" w:eastAsia="Calibri" w:hAnsi="Calibri" w:cs="Calibri"/>
-          <w:color w:val="333333"/>
-        </w:rPr>
-        <w:t>}}</w:t>
+          <w:rFonts w:ascii="Calibri" w:hAnsi="Calibri" w:eastAsia="Calibri" w:cs="Calibri"/>
+          <w:color w:val="333333"/>
+        </w:rPr>
+        <w:t>_BULLET_3</w:t>
+      </w:r>
+      <w:r>
+        <w:rPr>
+          <w:rFonts w:ascii="Calibri" w:hAnsi="Calibri" w:eastAsia="Calibri" w:cs="Calibri"/>
+          <w:color w:val="333333"/>
+        </w:rPr>
+        <w:t>}</w:t>
       </w:r>
     </w:p>
     <w:p>
@@ -460,37 +612,37 @@
           <w:numId w:val="5"/>
         </w:numPr>
         <w:rPr>
-          <w:rFonts w:ascii="Calibri" w:eastAsia="Calibri" w:hAnsi="Calibri" w:cs="Calibri"/>
-          <w:color w:val="333333"/>
-        </w:rPr>
-      </w:pPr>
-      <w:r>
-        <w:rPr>
-          <w:rFonts w:ascii="Calibri" w:eastAsia="Calibri" w:hAnsi="Calibri" w:cs="Calibri"/>
-          <w:color w:val="333333"/>
-        </w:rPr>
-        <w:t>{{</w:t>
-      </w:r>
-      <w:r>
-        <w:rPr>
-          <w:rFonts w:ascii="Calibri" w:eastAsia="Calibri" w:hAnsi="Calibri" w:cs="Calibri"/>
+          <w:rFonts w:ascii="Calibri" w:hAnsi="Calibri" w:eastAsia="Calibri" w:cs="Calibri"/>
+          <w:color w:val="333333"/>
+        </w:rPr>
+      </w:pPr>
+      <w:r>
+        <w:rPr>
+          <w:rFonts w:ascii="Calibri" w:hAnsi="Calibri" w:eastAsia="Calibri" w:cs="Calibri"/>
+          <w:color w:val="333333"/>
+        </w:rPr>
+        <w:t>{</w:t>
+      </w:r>
+      <w:r>
+        <w:rPr>
+          <w:rFonts w:ascii="Calibri" w:hAnsi="Calibri" w:eastAsia="Calibri" w:cs="Calibri"/>
           <w:color w:val="333333"/>
         </w:rPr>
         <w:t>AFINITI</w:t>
       </w:r>
       <w:r>
         <w:rPr>
-          <w:rFonts w:ascii="Calibri" w:eastAsia="Calibri" w:hAnsi="Calibri" w:cs="Calibri"/>
-          <w:color w:val="333333"/>
-        </w:rPr>
-        <w:t xml:space="preserve"> _BULLET_3</w:t>
-      </w:r>
-      <w:r>
-        <w:rPr>
-          <w:rFonts w:ascii="Calibri" w:eastAsia="Calibri" w:hAnsi="Calibri" w:cs="Calibri"/>
-          <w:color w:val="333333"/>
-        </w:rPr>
-        <w:t>}}</w:t>
+          <w:rFonts w:ascii="Calibri" w:hAnsi="Calibri" w:eastAsia="Calibri" w:cs="Calibri"/>
+          <w:color w:val="333333"/>
+        </w:rPr>
+        <w:t>_BULLET_4</w:t>
+      </w:r>
+      <w:r>
+        <w:rPr>
+          <w:rFonts w:ascii="Calibri" w:hAnsi="Calibri" w:eastAsia="Calibri" w:cs="Calibri"/>
+          <w:color w:val="333333"/>
+        </w:rPr>
+        <w:t>}</w:t>
       </w:r>
     </w:p>
     <w:p>
@@ -500,77 +652,44 @@
           <w:numId w:val="5"/>
         </w:numPr>
         <w:rPr>
-          <w:rFonts w:ascii="Calibri" w:eastAsia="Calibri" w:hAnsi="Calibri" w:cs="Calibri"/>
-          <w:color w:val="333333"/>
-        </w:rPr>
-      </w:pPr>
-      <w:r>
-        <w:rPr>
-          <w:rFonts w:ascii="Calibri" w:eastAsia="Calibri" w:hAnsi="Calibri" w:cs="Calibri"/>
-          <w:color w:val="333333"/>
-        </w:rPr>
-        <w:t>{{</w:t>
-      </w:r>
-      <w:r>
-        <w:rPr>
-          <w:rFonts w:ascii="Calibri" w:eastAsia="Calibri" w:hAnsi="Calibri" w:cs="Calibri"/>
+          <w:rFonts w:ascii="Calibri" w:hAnsi="Calibri" w:eastAsia="Calibri" w:cs="Calibri"/>
+          <w:color w:val="333333"/>
+        </w:rPr>
+      </w:pPr>
+      <w:r>
+        <w:rPr>
+          <w:rFonts w:ascii="Calibri" w:hAnsi="Calibri" w:eastAsia="Calibri" w:cs="Calibri"/>
+          <w:color w:val="333333"/>
+        </w:rPr>
+        <w:t>{</w:t>
+      </w:r>
+      <w:r>
+        <w:rPr>
+          <w:rFonts w:ascii="Calibri" w:hAnsi="Calibri" w:eastAsia="Calibri" w:cs="Calibri"/>
           <w:color w:val="333333"/>
         </w:rPr>
         <w:t>AFINITI</w:t>
       </w:r>
       <w:r>
         <w:rPr>
-          <w:rFonts w:ascii="Calibri" w:eastAsia="Calibri" w:hAnsi="Calibri" w:cs="Calibri"/>
-          <w:color w:val="333333"/>
-        </w:rPr>
-        <w:t xml:space="preserve"> _BULLET_4</w:t>
-      </w:r>
-      <w:r>
-        <w:rPr>
-          <w:rFonts w:ascii="Calibri" w:eastAsia="Calibri" w:hAnsi="Calibri" w:cs="Calibri"/>
-          <w:color w:val="333333"/>
-        </w:rPr>
-        <w:t>}}</w:t>
-      </w:r>
-    </w:p>
-    <w:p>
-      <w:pPr>
-        <w:numPr>
-          <w:ilvl w:val="0"/>
-          <w:numId w:val="5"/>
-        </w:numPr>
-        <w:rPr>
-          <w:rFonts w:ascii="Calibri" w:eastAsia="Calibri" w:hAnsi="Calibri" w:cs="Calibri"/>
-          <w:color w:val="333333"/>
-        </w:rPr>
-      </w:pPr>
-      <w:r>
-        <w:rPr>
-          <w:rFonts w:ascii="Calibri" w:eastAsia="Calibri" w:hAnsi="Calibri" w:cs="Calibri"/>
-          <w:color w:val="333333"/>
-        </w:rPr>
-        <w:t xml:space="preserve">{{AFINITI </w:t>
-      </w:r>
-      <w:r>
-        <w:rPr>
-          <w:rFonts w:ascii="Calibri" w:eastAsia="Calibri" w:hAnsi="Calibri" w:cs="Calibri"/>
+          <w:rFonts w:ascii="Calibri" w:hAnsi="Calibri" w:eastAsia="Calibri" w:cs="Calibri"/>
           <w:color w:val="333333"/>
         </w:rPr>
         <w:t>_BULLET_5</w:t>
       </w:r>
       <w:r>
         <w:rPr>
-          <w:rFonts w:ascii="Calibri" w:eastAsia="Calibri" w:hAnsi="Calibri" w:cs="Calibri"/>
-          <w:color w:val="333333"/>
-        </w:rPr>
-        <w:t>}}</w:t>
+          <w:rFonts w:ascii="Calibri" w:hAnsi="Calibri" w:eastAsia="Calibri" w:cs="Calibri"/>
+          <w:color w:val="333333"/>
+        </w:rPr>
+        <w:t>}</w:t>
       </w:r>
     </w:p>
     <w:p>
       <w:pPr>
         <w:spacing w:after="20"/>
         <w:rPr>
-          <w:rFonts w:ascii="Calibri" w:eastAsia="Calibri" w:hAnsi="Calibri" w:cs="Calibri"/>
+          <w:rFonts w:ascii="Calibri" w:hAnsi="Calibri" w:eastAsia="Calibri" w:cs="Calibri"/>
           <w:b/>
           <w:bCs/>
           <w:color w:val="333333"/>
@@ -578,7 +697,7 @@
       </w:pPr>
       <w:r>
         <w:rPr>
-          <w:rFonts w:ascii="Calibri" w:eastAsia="Calibri" w:hAnsi="Calibri" w:cs="Calibri"/>
+          <w:rFonts w:ascii="Calibri" w:hAnsi="Calibri" w:eastAsia="Calibri" w:cs="Calibri"/>
           <w:b/>
           <w:bCs/>
           <w:color w:val="333333"/>
@@ -590,13 +709,13 @@
       <w:pPr>
         <w:spacing w:after="20"/>
         <w:rPr>
-          <w:rFonts w:ascii="Calibri" w:eastAsia="Calibri" w:hAnsi="Calibri" w:cs="Calibri"/>
-          <w:color w:val="333333"/>
-        </w:rPr>
-      </w:pPr>
-      <w:r>
-        <w:rPr>
-          <w:rFonts w:ascii="Calibri" w:eastAsia="Calibri" w:hAnsi="Calibri" w:cs="Calibri"/>
+          <w:rFonts w:ascii="Calibri" w:hAnsi="Calibri" w:eastAsia="Calibri" w:cs="Calibri"/>
+          <w:color w:val="333333"/>
+        </w:rPr>
+      </w:pPr>
+      <w:r>
+        <w:rPr>
+          <w:rFonts w:ascii="Calibri" w:hAnsi="Calibri" w:eastAsia="Calibri" w:cs="Calibri"/>
           <w:color w:val="333333"/>
         </w:rPr>
         <w:t>Dec 2021 – June 2022</w:t>
@@ -609,23 +728,30 @@
           <w:numId w:val="1"/>
         </w:numPr>
         <w:rPr>
-          <w:rFonts w:ascii="Calibri" w:eastAsia="Calibri" w:hAnsi="Calibri" w:cs="Calibri"/>
-          <w:color w:val="333333"/>
-        </w:rPr>
-      </w:pPr>
-      <w:r>
-        <w:rPr>
-          <w:rFonts w:ascii="Calibri" w:eastAsia="Calibri" w:hAnsi="Calibri" w:cs="Calibri"/>
-          <w:color w:val="333333"/>
-        </w:rPr>
-        <w:t>{{CONTOUR_BULLET_1</w:t>
-      </w:r>
-      <w:r>
-        <w:rPr>
-          <w:rFonts w:ascii="Calibri" w:eastAsia="Calibri" w:hAnsi="Calibri" w:cs="Calibri"/>
-          <w:color w:val="333333"/>
-        </w:rPr>
-        <w:t>}}</w:t>
+          <w:rFonts w:ascii="Calibri" w:hAnsi="Calibri" w:eastAsia="Calibri" w:cs="Calibri"/>
+          <w:color w:val="333333"/>
+        </w:rPr>
+      </w:pPr>
+      <w:r>
+        <w:rPr>
+          <w:rFonts w:ascii="Calibri" w:hAnsi="Calibri" w:eastAsia="Calibri" w:cs="Calibri"/>
+          <w:color w:val="333333"/>
+        </w:rPr>
+        <w:t>{</w:t>
+      </w:r>
+      <w:r>
+        <w:rPr>
+          <w:rFonts w:ascii="Calibri" w:hAnsi="Calibri" w:eastAsia="Calibri" w:cs="Calibri"/>
+          <w:color w:val="333333"/>
+        </w:rPr>
+        <w:t>CONTOUR_BULLET_1</w:t>
+      </w:r>
+      <w:r>
+        <w:rPr>
+          <w:rFonts w:ascii="Calibri" w:hAnsi="Calibri" w:eastAsia="Calibri" w:cs="Calibri"/>
+          <w:color w:val="333333"/>
+        </w:rPr>
+        <w:t>}</w:t>
       </w:r>
     </w:p>
     <w:p>
@@ -635,37 +761,37 @@
           <w:numId w:val="1"/>
         </w:numPr>
         <w:rPr>
-          <w:rFonts w:ascii="Calibri" w:eastAsia="Calibri" w:hAnsi="Calibri" w:cs="Calibri"/>
-          <w:color w:val="333333"/>
-        </w:rPr>
-      </w:pPr>
-      <w:r>
-        <w:rPr>
-          <w:rFonts w:ascii="Calibri" w:eastAsia="Calibri" w:hAnsi="Calibri" w:cs="Calibri"/>
-          <w:color w:val="333333"/>
-        </w:rPr>
-        <w:t>{{</w:t>
-      </w:r>
-      <w:r>
-        <w:rPr>
-          <w:rFonts w:ascii="Calibri" w:eastAsia="Calibri" w:hAnsi="Calibri" w:cs="Calibri"/>
+          <w:rFonts w:ascii="Calibri" w:hAnsi="Calibri" w:eastAsia="Calibri" w:cs="Calibri"/>
+          <w:color w:val="333333"/>
+        </w:rPr>
+      </w:pPr>
+      <w:r>
+        <w:rPr>
+          <w:rFonts w:ascii="Calibri" w:hAnsi="Calibri" w:eastAsia="Calibri" w:cs="Calibri"/>
+          <w:color w:val="333333"/>
+        </w:rPr>
+        <w:t>{</w:t>
+      </w:r>
+      <w:r>
+        <w:rPr>
+          <w:rFonts w:ascii="Calibri" w:hAnsi="Calibri" w:eastAsia="Calibri" w:cs="Calibri"/>
           <w:color w:val="333333"/>
         </w:rPr>
         <w:t>CONTOUR</w:t>
       </w:r>
       <w:r>
         <w:rPr>
-          <w:rFonts w:ascii="Calibri" w:eastAsia="Calibri" w:hAnsi="Calibri" w:cs="Calibri"/>
-          <w:color w:val="333333"/>
-        </w:rPr>
-        <w:t xml:space="preserve"> _BULLET_2</w:t>
-      </w:r>
-      <w:r>
-        <w:rPr>
-          <w:rFonts w:ascii="Calibri" w:eastAsia="Calibri" w:hAnsi="Calibri" w:cs="Calibri"/>
-          <w:color w:val="333333"/>
-        </w:rPr>
-        <w:t>}}</w:t>
+          <w:rFonts w:ascii="Calibri" w:hAnsi="Calibri" w:eastAsia="Calibri" w:cs="Calibri"/>
+          <w:color w:val="333333"/>
+        </w:rPr>
+        <w:t>_BULLET_2</w:t>
+      </w:r>
+      <w:r>
+        <w:rPr>
+          <w:rFonts w:ascii="Calibri" w:hAnsi="Calibri" w:eastAsia="Calibri" w:cs="Calibri"/>
+          <w:color w:val="333333"/>
+        </w:rPr>
+        <w:t>}</w:t>
       </w:r>
     </w:p>
     <w:p>
@@ -675,44 +801,44 @@
           <w:numId w:val="1"/>
         </w:numPr>
         <w:rPr>
-          <w:rFonts w:ascii="Calibri" w:eastAsia="Calibri" w:hAnsi="Calibri" w:cs="Calibri"/>
-          <w:color w:val="333333"/>
-        </w:rPr>
-      </w:pPr>
-      <w:r>
-        <w:rPr>
-          <w:rFonts w:ascii="Calibri" w:eastAsia="Calibri" w:hAnsi="Calibri" w:cs="Calibri"/>
-          <w:color w:val="333333"/>
-        </w:rPr>
-        <w:t>{{CONTOUR</w:t>
-      </w:r>
-      <w:r>
-        <w:rPr>
-          <w:rFonts w:ascii="Calibri" w:eastAsia="Calibri" w:hAnsi="Calibri" w:cs="Calibri"/>
-          <w:color w:val="333333"/>
-        </w:rPr>
-        <w:t xml:space="preserve"> </w:t>
-      </w:r>
-      <w:r>
-        <w:rPr>
-          <w:rFonts w:ascii="Calibri" w:eastAsia="Calibri" w:hAnsi="Calibri" w:cs="Calibri"/>
+          <w:rFonts w:ascii="Calibri" w:hAnsi="Calibri" w:eastAsia="Calibri" w:cs="Calibri"/>
+          <w:color w:val="333333"/>
+        </w:rPr>
+      </w:pPr>
+      <w:r>
+        <w:rPr>
+          <w:rFonts w:ascii="Calibri" w:hAnsi="Calibri" w:eastAsia="Calibri" w:cs="Calibri"/>
+          <w:color w:val="333333"/>
+        </w:rPr>
+        <w:t>{</w:t>
+      </w:r>
+      <w:r>
+        <w:rPr>
+          <w:rFonts w:ascii="Calibri" w:hAnsi="Calibri" w:eastAsia="Calibri" w:cs="Calibri"/>
+          <w:color w:val="333333"/>
+        </w:rPr>
+        <w:t>CONTOUR</w:t>
+      </w:r>
+      <w:r>
+        <w:rPr>
+          <w:rFonts w:ascii="Calibri" w:hAnsi="Calibri" w:eastAsia="Calibri" w:cs="Calibri"/>
           <w:color w:val="333333"/>
         </w:rPr>
         <w:t>_BULLET_3</w:t>
       </w:r>
       <w:r>
         <w:rPr>
-          <w:rFonts w:ascii="Calibri" w:eastAsia="Calibri" w:hAnsi="Calibri" w:cs="Calibri"/>
-          <w:color w:val="333333"/>
-        </w:rPr>
-        <w:t>}}</w:t>
+          <w:rFonts w:ascii="Calibri" w:hAnsi="Calibri" w:eastAsia="Calibri" w:cs="Calibri"/>
+          <w:color w:val="333333"/>
+        </w:rPr>
+        <w:t>}</w:t>
       </w:r>
     </w:p>
     <w:p>
       <w:pPr>
         <w:spacing w:after="20"/>
         <w:rPr>
-          <w:rFonts w:ascii="Calibri" w:eastAsia="Calibri" w:hAnsi="Calibri" w:cs="Calibri"/>
+          <w:rFonts w:ascii="Calibri" w:hAnsi="Calibri" w:eastAsia="Calibri" w:cs="Calibri"/>
           <w:b/>
           <w:bCs/>
           <w:color w:val="333333"/>
@@ -720,7 +846,7 @@
       </w:pPr>
       <w:r>
         <w:rPr>
-          <w:rFonts w:ascii="Calibri" w:eastAsia="Calibri" w:hAnsi="Calibri" w:cs="Calibri"/>
+          <w:rFonts w:ascii="Calibri" w:hAnsi="Calibri" w:eastAsia="Calibri" w:cs="Calibri"/>
           <w:b/>
           <w:bCs/>
           <w:color w:val="333333"/>
@@ -732,13 +858,13 @@
       <w:pPr>
         <w:spacing w:after="20"/>
         <w:rPr>
-          <w:rFonts w:ascii="Calibri" w:eastAsia="Calibri" w:hAnsi="Calibri" w:cs="Calibri"/>
-          <w:color w:val="333333"/>
-        </w:rPr>
-      </w:pPr>
-      <w:r>
-        <w:rPr>
-          <w:rFonts w:ascii="Calibri" w:eastAsia="Calibri" w:hAnsi="Calibri" w:cs="Calibri"/>
+          <w:rFonts w:ascii="Calibri" w:hAnsi="Calibri" w:eastAsia="Calibri" w:cs="Calibri"/>
+          <w:color w:val="333333"/>
+        </w:rPr>
+      </w:pPr>
+      <w:r>
+        <w:rPr>
+          <w:rFonts w:ascii="Calibri" w:hAnsi="Calibri" w:eastAsia="Calibri" w:cs="Calibri"/>
           <w:color w:val="333333"/>
         </w:rPr>
         <w:t>April 2021 – November 2021</w:t>
@@ -751,39 +877,39 @@
           <w:numId w:val="1"/>
         </w:numPr>
         <w:rPr>
-          <w:rFonts w:ascii="Calibri" w:eastAsia="Calibri" w:hAnsi="Calibri" w:cs="Calibri"/>
-          <w:color w:val="333333"/>
-        </w:rPr>
-      </w:pPr>
-      <w:bookmarkStart w:id="3" w:name="_czm2rdjw2v9l" w:colFirst="0" w:colLast="0"/>
+          <w:rFonts w:ascii="Calibri" w:hAnsi="Calibri" w:eastAsia="Calibri" w:cs="Calibri"/>
+          <w:color w:val="333333"/>
+        </w:rPr>
+      </w:pPr>
+      <w:bookmarkStart w:name="_czm2rdjw2v9l" w:id="3"/>
       <w:bookmarkEnd w:id="3"/>
       <w:r>
         <w:rPr>
-          <w:rFonts w:ascii="Calibri" w:eastAsia="Calibri" w:hAnsi="Calibri" w:cs="Calibri"/>
-          <w:color w:val="333333"/>
-        </w:rPr>
-        <w:t>{{</w:t>
-      </w:r>
-      <w:r>
-        <w:rPr>
-          <w:rFonts w:ascii="Calibri" w:eastAsia="Calibri" w:hAnsi="Calibri" w:cs="Calibri"/>
+          <w:rFonts w:ascii="Calibri" w:hAnsi="Calibri" w:eastAsia="Calibri" w:cs="Calibri"/>
+          <w:color w:val="333333"/>
+        </w:rPr>
+        <w:t>{</w:t>
+      </w:r>
+      <w:r>
+        <w:rPr>
+          <w:rFonts w:ascii="Calibri" w:hAnsi="Calibri" w:eastAsia="Calibri" w:cs="Calibri"/>
           <w:color w:val="333333"/>
         </w:rPr>
         <w:t>TPS</w:t>
       </w:r>
       <w:r>
         <w:rPr>
-          <w:rFonts w:ascii="Calibri" w:eastAsia="Calibri" w:hAnsi="Calibri" w:cs="Calibri"/>
+          <w:rFonts w:ascii="Calibri" w:hAnsi="Calibri" w:eastAsia="Calibri" w:cs="Calibri"/>
           <w:color w:val="333333"/>
         </w:rPr>
         <w:t>_BULLET_1</w:t>
       </w:r>
       <w:r>
         <w:rPr>
-          <w:rFonts w:ascii="Calibri" w:eastAsia="Calibri" w:hAnsi="Calibri" w:cs="Calibri"/>
-          <w:color w:val="333333"/>
-        </w:rPr>
-        <w:t>}}</w:t>
+          <w:rFonts w:ascii="Calibri" w:hAnsi="Calibri" w:eastAsia="Calibri" w:cs="Calibri"/>
+          <w:color w:val="333333"/>
+        </w:rPr>
+        <w:t>}</w:t>
       </w:r>
     </w:p>
     <w:p>
@@ -793,23 +919,30 @@
           <w:numId w:val="1"/>
         </w:numPr>
         <w:rPr>
-          <w:rFonts w:ascii="Calibri" w:eastAsia="Calibri" w:hAnsi="Calibri" w:cs="Calibri"/>
-          <w:color w:val="333333"/>
-        </w:rPr>
-      </w:pPr>
-      <w:r>
-        <w:rPr>
-          <w:rFonts w:ascii="Calibri" w:eastAsia="Calibri" w:hAnsi="Calibri" w:cs="Calibri"/>
-          <w:color w:val="333333"/>
-        </w:rPr>
-        <w:t>{{TPS_BULLET_2</w:t>
-      </w:r>
-      <w:r>
-        <w:rPr>
-          <w:rFonts w:ascii="Calibri" w:eastAsia="Calibri" w:hAnsi="Calibri" w:cs="Calibri"/>
-          <w:color w:val="333333"/>
-        </w:rPr>
-        <w:t>}}</w:t>
+          <w:rFonts w:ascii="Calibri" w:hAnsi="Calibri" w:eastAsia="Calibri" w:cs="Calibri"/>
+          <w:color w:val="333333"/>
+        </w:rPr>
+      </w:pPr>
+      <w:r>
+        <w:rPr>
+          <w:rFonts w:ascii="Calibri" w:hAnsi="Calibri" w:eastAsia="Calibri" w:cs="Calibri"/>
+          <w:color w:val="333333"/>
+        </w:rPr>
+        <w:t>{</w:t>
+      </w:r>
+      <w:r>
+        <w:rPr>
+          <w:rFonts w:ascii="Calibri" w:hAnsi="Calibri" w:eastAsia="Calibri" w:cs="Calibri"/>
+          <w:color w:val="333333"/>
+        </w:rPr>
+        <w:t>TPS_BULLET_2</w:t>
+      </w:r>
+      <w:r>
+        <w:rPr>
+          <w:rFonts w:ascii="Calibri" w:hAnsi="Calibri" w:eastAsia="Calibri" w:cs="Calibri"/>
+          <w:color w:val="333333"/>
+        </w:rPr>
+        <w:t>}</w:t>
       </w:r>
     </w:p>
     <w:p>
@@ -819,37 +952,37 @@
           <w:numId w:val="1"/>
         </w:numPr>
         <w:rPr>
-          <w:rFonts w:ascii="Calibri" w:eastAsia="Calibri" w:hAnsi="Calibri" w:cs="Calibri"/>
-          <w:color w:val="333333"/>
-        </w:rPr>
-      </w:pPr>
-      <w:r>
-        <w:rPr>
-          <w:rFonts w:ascii="Calibri" w:eastAsia="Calibri" w:hAnsi="Calibri" w:cs="Calibri"/>
-          <w:color w:val="333333"/>
-        </w:rPr>
-        <w:t>{{</w:t>
-      </w:r>
-      <w:r>
-        <w:rPr>
-          <w:rFonts w:ascii="Calibri" w:eastAsia="Calibri" w:hAnsi="Calibri" w:cs="Calibri"/>
+          <w:rFonts w:ascii="Calibri" w:hAnsi="Calibri" w:eastAsia="Calibri" w:cs="Calibri"/>
+          <w:color w:val="333333"/>
+        </w:rPr>
+      </w:pPr>
+      <w:r>
+        <w:rPr>
+          <w:rFonts w:ascii="Calibri" w:hAnsi="Calibri" w:eastAsia="Calibri" w:cs="Calibri"/>
+          <w:color w:val="333333"/>
+        </w:rPr>
+        <w:t>{</w:t>
+      </w:r>
+      <w:r>
+        <w:rPr>
+          <w:rFonts w:ascii="Calibri" w:hAnsi="Calibri" w:eastAsia="Calibri" w:cs="Calibri"/>
           <w:color w:val="333333"/>
         </w:rPr>
         <w:t>TPS</w:t>
       </w:r>
       <w:r>
         <w:rPr>
-          <w:rFonts w:ascii="Calibri" w:eastAsia="Calibri" w:hAnsi="Calibri" w:cs="Calibri"/>
+          <w:rFonts w:ascii="Calibri" w:hAnsi="Calibri" w:eastAsia="Calibri" w:cs="Calibri"/>
           <w:color w:val="333333"/>
         </w:rPr>
         <w:t>_BULLET_3</w:t>
       </w:r>
       <w:r>
         <w:rPr>
-          <w:rFonts w:ascii="Calibri" w:eastAsia="Calibri" w:hAnsi="Calibri" w:cs="Calibri"/>
-          <w:color w:val="333333"/>
-        </w:rPr>
-        <w:t>}}</w:t>
+          <w:rFonts w:ascii="Calibri" w:hAnsi="Calibri" w:eastAsia="Calibri" w:cs="Calibri"/>
+          <w:color w:val="333333"/>
+        </w:rPr>
+        <w:t>}</w:t>
       </w:r>
     </w:p>
     <w:p>
@@ -858,17 +991,17 @@
         <w:keepNext w:val="0"/>
         <w:keepLines w:val="0"/>
         <w:pBdr>
-          <w:bottom w:val="single" w:sz="6" w:space="2" w:color="000000"/>
+          <w:bottom w:val="single" w:color="000000" w:sz="6" w:space="2"/>
         </w:pBdr>
         <w:spacing w:before="220" w:after="80" w:line="240" w:lineRule="auto"/>
         <w:rPr>
-          <w:rFonts w:ascii="Calibri" w:eastAsia="Calibri" w:hAnsi="Calibri" w:cs="Calibri"/>
-          <w:color w:val="333333"/>
-        </w:rPr>
-      </w:pPr>
-      <w:r>
-        <w:rPr>
-          <w:rFonts w:ascii="Calibri" w:eastAsia="Calibri" w:hAnsi="Calibri" w:cs="Calibri"/>
+          <w:rFonts w:ascii="Calibri" w:hAnsi="Calibri" w:eastAsia="Calibri" w:cs="Calibri"/>
+          <w:color w:val="333333"/>
+        </w:rPr>
+      </w:pPr>
+      <w:r>
+        <w:rPr>
+          <w:rFonts w:ascii="Calibri" w:hAnsi="Calibri" w:eastAsia="Calibri" w:cs="Calibri"/>
           <w:b/>
           <w:bCs/>
           <w:sz w:val="22"/>
@@ -881,40 +1014,76 @@
       <w:pPr>
         <w:spacing w:after="20" w:line="240" w:lineRule="auto"/>
         <w:rPr>
-          <w:rFonts w:ascii="Calibri" w:eastAsia="Calibri" w:hAnsi="Calibri" w:cs="Calibri"/>
-          <w:b/>
-          <w:bCs/>
-          <w:color w:val="333333"/>
-        </w:rPr>
-      </w:pPr>
-      <w:r>
-        <w:rPr>
-          <w:rFonts w:ascii="Calibri" w:eastAsia="Calibri" w:hAnsi="Calibri" w:cs="Calibri"/>
-          <w:b/>
-          <w:bCs/>
-          <w:color w:val="333333"/>
-        </w:rPr>
-        <w:t>{{DEGREE}}</w:t>
+          <w:rFonts w:ascii="Calibri" w:hAnsi="Calibri" w:eastAsia="Calibri" w:cs="Calibri"/>
+          <w:b w:val="1"/>
+          <w:bCs w:val="1"/>
+          <w:color w:val="333333"/>
+        </w:rPr>
+      </w:pPr>
+      <w:r>
+        <w:rPr>
+          <w:rFonts w:ascii="Calibri" w:hAnsi="Calibri" w:eastAsia="Calibri" w:cs="Calibri"/>
+          <w:b w:val="1"/>
+          <w:bCs w:val="1"/>
+          <w:color w:val="333333"/>
+        </w:rPr>
+        <w:t>{</w:t>
+      </w:r>
+      <w:r>
+        <w:rPr>
+          <w:rFonts w:ascii="Calibri" w:hAnsi="Calibri" w:eastAsia="Calibri" w:cs="Calibri"/>
+          <w:b w:val="1"/>
+          <w:bCs w:val="1"/>
+          <w:color w:val="333333"/>
+        </w:rPr>
+        <w:t>DEGREE</w:t>
+      </w:r>
+      <w:r>
+        <w:rPr>
+          <w:rFonts w:ascii="Calibri" w:hAnsi="Calibri" w:eastAsia="Calibri" w:cs="Calibri"/>
+          <w:b w:val="1"/>
+          <w:bCs w:val="1"/>
+          <w:color w:val="333333"/>
+        </w:rPr>
+        <w:t>}</w:t>
       </w:r>
     </w:p>
     <w:p>
       <w:pPr>
         <w:spacing w:after="20" w:line="240" w:lineRule="auto"/>
         <w:rPr>
-          <w:rFonts w:ascii="Calibri" w:eastAsia="Calibri" w:hAnsi="Calibri" w:cs="Calibri"/>
-          <w:i/>
-          <w:iCs/>
-          <w:color w:val="333333"/>
-        </w:rPr>
-      </w:pPr>
-      <w:r>
-        <w:rPr>
-          <w:rFonts w:ascii="Calibri" w:eastAsia="Calibri" w:hAnsi="Calibri" w:cs="Calibri"/>
-          <w:i/>
-          <w:iCs/>
-          <w:color w:val="333333"/>
-        </w:rPr>
-        <w:t>{{UNIVERSITY_NAME}}</w:t>
+          <w:rFonts w:ascii="Calibri" w:hAnsi="Calibri" w:eastAsia="Calibri" w:cs="Calibri"/>
+          <w:i w:val="1"/>
+          <w:iCs w:val="1"/>
+          <w:color w:val="333333"/>
+        </w:rPr>
+      </w:pPr>
+      <w:r>
+        <w:rPr>
+          <w:rFonts w:ascii="Calibri" w:hAnsi="Calibri" w:eastAsia="Calibri" w:cs="Calibri"/>
+          <w:i w:val="1"/>
+          <w:iCs w:val="1"/>
+          <w:color w:val="333333"/>
+        </w:rPr>
+        <w:t>{</w:t>
+      </w:r>
+      <w:r>
+        <w:rPr>
+          <w:rFonts w:ascii="Calibri" w:hAnsi="Calibri" w:eastAsia="Calibri" w:cs="Calibri"/>
+          <w:i w:val="1"/>
+          <w:iCs w:val="1"/>
+          <w:color w:val="333333"/>
+        </w:rPr>
+        <w:t>UNIVERSITY</w:t>
+      </w:r>
+      <w:r>
+        <w:rPr>
+          <w:rFonts w:ascii="Calibri" w:hAnsi="Calibri" w:eastAsia="Calibri" w:cs="Calibri"/>
+          <w:i w:val="1"/>
+          <w:iCs w:val="1"/>
+          <w:color w:val="333333"/>
+        </w:rPr>
+        <w:t>}</w:t>
       </w:r>
     </w:p>
     <w:p>
@@ -923,22 +1092,22 @@
         <w:keepNext w:val="0"/>
         <w:keepLines w:val="0"/>
         <w:pBdr>
-          <w:bottom w:val="single" w:sz="6" w:space="2" w:color="000000"/>
+          <w:bottom w:val="single" w:color="000000" w:sz="6" w:space="2"/>
         </w:pBdr>
         <w:spacing w:before="220" w:after="80" w:line="240" w:lineRule="auto"/>
         <w:rPr>
-          <w:rFonts w:ascii="Calibri" w:eastAsia="Calibri" w:hAnsi="Calibri" w:cs="Calibri"/>
+          <w:rFonts w:ascii="Calibri" w:hAnsi="Calibri" w:eastAsia="Calibri" w:cs="Calibri"/>
           <w:b/>
           <w:bCs/>
           <w:sz w:val="22"/>
           <w:szCs w:val="22"/>
         </w:rPr>
       </w:pPr>
-      <w:bookmarkStart w:id="4" w:name="_qfj260p966m1" w:colFirst="0" w:colLast="0"/>
+      <w:bookmarkStart w:name="_qfj260p966m1" w:colFirst="0" w:colLast="0" w:id="4"/>
       <w:bookmarkEnd w:id="4"/>
       <w:r>
         <w:rPr>
-          <w:rFonts w:ascii="Calibri" w:eastAsia="Calibri" w:hAnsi="Calibri" w:cs="Calibri"/>
+          <w:rFonts w:ascii="Calibri" w:hAnsi="Calibri" w:eastAsia="Calibri" w:cs="Calibri"/>
           <w:b/>
           <w:bCs/>
           <w:sz w:val="22"/>
@@ -955,32 +1124,66 @@
         </w:numPr>
         <w:spacing w:before="180" w:line="240" w:lineRule="auto"/>
         <w:rPr>
-          <w:rFonts w:ascii="Calibri" w:eastAsia="Calibri" w:hAnsi="Calibri" w:cs="Calibri"/>
-          <w:color w:val="333333"/>
-        </w:rPr>
-      </w:pPr>
-      <w:r>
-        <w:rPr>
-          <w:rFonts w:ascii="Calibri" w:eastAsia="Calibri" w:hAnsi="Calibri" w:cs="Calibri"/>
-          <w:color w:val="333333"/>
-        </w:rPr>
-        <w:t>Languages &amp; Frameworks: {{</w:t>
-      </w:r>
-      <w:proofErr w:type="spellStart"/>
-      <w:r>
-        <w:rPr>
-          <w:rFonts w:ascii="Calibri" w:eastAsia="Calibri" w:hAnsi="Calibri" w:cs="Calibri"/>
-          <w:color w:val="333333"/>
-        </w:rPr>
-        <w:t>Languages&amp;Frameworks</w:t>
-      </w:r>
-      <w:proofErr w:type="spellEnd"/>
-      <w:r>
-        <w:rPr>
-          <w:rFonts w:ascii="Calibri" w:eastAsia="Calibri" w:hAnsi="Calibri" w:cs="Calibri"/>
-          <w:color w:val="333333"/>
-        </w:rPr>
-        <w:t>}}</w:t>
+          <w:rFonts w:ascii="Calibri" w:hAnsi="Calibri" w:eastAsia="Calibri" w:cs="Calibri"/>
+          <w:color w:val="333333"/>
+          <w:lang w:val="en-US"/>
+        </w:rPr>
+      </w:pPr>
+      <w:r>
+        <w:rPr>
+          <w:rFonts w:ascii="Calibri" w:hAnsi="Calibri" w:eastAsia="Calibri" w:cs="Calibri"/>
+          <w:color w:val="333333"/>
+          <w:lang w:val="en-US"/>
+        </w:rPr>
+        <w:t xml:space="preserve">Languages &amp; Frameworks: </w:t>
+      </w:r>
+      <w:r>
+        <w:rPr>
+          <w:rFonts w:ascii="Calibri" w:hAnsi="Calibri" w:eastAsia="Calibri" w:cs="Calibri"/>
+          <w:color w:val="333333"/>
+          <w:lang w:val="en-US"/>
+        </w:rPr>
+        <w:t>{</w:t>
+      </w:r>
+      <w:r>
+        <w:rPr>
+          <w:rFonts w:ascii="Calibri" w:hAnsi="Calibri" w:eastAsia="Calibri" w:cs="Calibri"/>
+          <w:color w:val="333333"/>
+          <w:lang w:val="en-US"/>
+        </w:rPr>
+        <w:t>L</w:t>
+      </w:r>
+      <w:r>
+        <w:rPr>
+          <w:rFonts w:ascii="Calibri" w:hAnsi="Calibri" w:eastAsia="Calibri" w:cs="Calibri"/>
+          <w:color w:val="333333"/>
+          <w:lang w:val="en-US"/>
+        </w:rPr>
+        <w:t>ANGUAGES_</w:t>
+      </w:r>
+      <w:r>
+        <w:rPr>
+          <w:rFonts w:ascii="Calibri" w:hAnsi="Calibri" w:eastAsia="Calibri" w:cs="Calibri"/>
+          <w:color w:val="333333"/>
+          <w:lang w:val="en-US"/>
+        </w:rPr>
+        <w:t>F</w:t>
+      </w:r>
+      <w:r>
+        <w:rPr>
+          <w:rFonts w:ascii="Calibri" w:hAnsi="Calibri" w:eastAsia="Calibri" w:cs="Calibri"/>
+          <w:color w:val="333333"/>
+          <w:lang w:val="en-US"/>
+        </w:rPr>
+        <w:t>RAMEWORKS</w:t>
+      </w:r>
+      <w:r>
+        <w:rPr>
+          <w:rFonts w:ascii="Calibri" w:hAnsi="Calibri" w:eastAsia="Calibri" w:cs="Calibri"/>
+          <w:color w:val="333333"/>
+          <w:lang w:val="en-US"/>
+        </w:rPr>
+        <w:t>}</w:t>
       </w:r>
     </w:p>
     <w:p>
@@ -991,32 +1194,66 @@
         </w:numPr>
         <w:spacing w:line="240" w:lineRule="auto"/>
         <w:rPr>
-          <w:rFonts w:ascii="Calibri" w:eastAsia="Calibri" w:hAnsi="Calibri" w:cs="Calibri"/>
-          <w:color w:val="333333"/>
-        </w:rPr>
-      </w:pPr>
-      <w:r>
-        <w:rPr>
-          <w:rFonts w:ascii="Calibri" w:eastAsia="Calibri" w:hAnsi="Calibri" w:cs="Calibri"/>
-          <w:color w:val="333333"/>
-        </w:rPr>
-        <w:t>Tools &amp; Platforms: {{</w:t>
-      </w:r>
-      <w:proofErr w:type="spellStart"/>
-      <w:r>
-        <w:rPr>
-          <w:rFonts w:ascii="Calibri" w:eastAsia="Calibri" w:hAnsi="Calibri" w:cs="Calibri"/>
-          <w:color w:val="333333"/>
-        </w:rPr>
-        <w:t>Tools&amp;Platforms</w:t>
-      </w:r>
-      <w:proofErr w:type="spellEnd"/>
-      <w:r>
-        <w:rPr>
-          <w:rFonts w:ascii="Calibri" w:eastAsia="Calibri" w:hAnsi="Calibri" w:cs="Calibri"/>
-          <w:color w:val="333333"/>
-        </w:rPr>
-        <w:t>}}</w:t>
+          <w:rFonts w:ascii="Calibri" w:hAnsi="Calibri" w:eastAsia="Calibri" w:cs="Calibri"/>
+          <w:color w:val="333333"/>
+          <w:lang w:val="en-US"/>
+        </w:rPr>
+      </w:pPr>
+      <w:r>
+        <w:rPr>
+          <w:rFonts w:ascii="Calibri" w:hAnsi="Calibri" w:eastAsia="Calibri" w:cs="Calibri"/>
+          <w:color w:val="333333"/>
+          <w:lang w:val="en-US"/>
+        </w:rPr>
+        <w:t xml:space="preserve">Tools &amp; Platforms: </w:t>
+      </w:r>
+      <w:r>
+        <w:rPr>
+          <w:rFonts w:ascii="Calibri" w:hAnsi="Calibri" w:eastAsia="Calibri" w:cs="Calibri"/>
+          <w:color w:val="333333"/>
+          <w:lang w:val="en-US"/>
+        </w:rPr>
+        <w:t>{</w:t>
+      </w:r>
+      <w:r>
+        <w:rPr>
+          <w:rFonts w:ascii="Calibri" w:hAnsi="Calibri" w:eastAsia="Calibri" w:cs="Calibri"/>
+          <w:color w:val="333333"/>
+          <w:lang w:val="en-US"/>
+        </w:rPr>
+        <w:t>T</w:t>
+      </w:r>
+      <w:r>
+        <w:rPr>
+          <w:rFonts w:ascii="Calibri" w:hAnsi="Calibri" w:eastAsia="Calibri" w:cs="Calibri"/>
+          <w:color w:val="333333"/>
+          <w:lang w:val="en-US"/>
+        </w:rPr>
+        <w:t>OOLS_</w:t>
+      </w:r>
+      <w:r>
+        <w:rPr>
+          <w:rFonts w:ascii="Calibri" w:hAnsi="Calibri" w:eastAsia="Calibri" w:cs="Calibri"/>
+          <w:color w:val="333333"/>
+          <w:lang w:val="en-US"/>
+        </w:rPr>
+        <w:t>P</w:t>
+      </w:r>
+      <w:r>
+        <w:rPr>
+          <w:rFonts w:ascii="Calibri" w:hAnsi="Calibri" w:eastAsia="Calibri" w:cs="Calibri"/>
+          <w:color w:val="333333"/>
+          <w:lang w:val="en-US"/>
+        </w:rPr>
+        <w:t>LATFORMS</w:t>
+      </w:r>
+      <w:r>
+        <w:rPr>
+          <w:rFonts w:ascii="Calibri" w:hAnsi="Calibri" w:eastAsia="Calibri" w:cs="Calibri"/>
+          <w:color w:val="333333"/>
+          <w:lang w:val="en-US"/>
+        </w:rPr>
+        <w:t>}</w:t>
       </w:r>
     </w:p>
     <w:p>
@@ -1027,23 +1264,44 @@
         </w:numPr>
         <w:spacing w:after="180" w:line="240" w:lineRule="auto"/>
         <w:rPr>
-          <w:rFonts w:ascii="Calibri" w:eastAsia="Calibri" w:hAnsi="Calibri" w:cs="Calibri"/>
-          <w:color w:val="333333"/>
-        </w:rPr>
-      </w:pPr>
-      <w:r>
-        <w:rPr>
-          <w:rFonts w:ascii="Calibri" w:eastAsia="Calibri" w:hAnsi="Calibri" w:cs="Calibri"/>
+          <w:rFonts w:ascii="Calibri" w:hAnsi="Calibri" w:eastAsia="Calibri" w:cs="Calibri"/>
+          <w:color w:val="333333"/>
+        </w:rPr>
+      </w:pPr>
+      <w:r>
+        <w:rPr>
+          <w:rFonts w:ascii="Calibri" w:hAnsi="Calibri" w:eastAsia="Calibri" w:cs="Calibri"/>
           <w:color w:val="333333"/>
         </w:rPr>
         <w:t xml:space="preserve">Specializations: </w:t>
       </w:r>
       <w:r>
         <w:rPr>
-          <w:rFonts w:ascii="Calibri" w:eastAsia="Calibri" w:hAnsi="Calibri" w:cs="Calibri"/>
-          <w:color w:val="333333"/>
-        </w:rPr>
-        <w:t>{{Specializations}}</w:t>
+          <w:rFonts w:ascii="Calibri" w:hAnsi="Calibri" w:eastAsia="Calibri" w:cs="Calibri"/>
+          <w:color w:val="333333"/>
+        </w:rPr>
+        <w:t>{</w:t>
+      </w:r>
+      <w:r>
+        <w:rPr>
+          <w:rFonts w:ascii="Calibri" w:hAnsi="Calibri" w:eastAsia="Calibri" w:cs="Calibri"/>
+          <w:color w:val="333333"/>
+        </w:rPr>
+        <w:t>S</w:t>
+      </w:r>
+      <w:r>
+        <w:rPr>
+          <w:rFonts w:ascii="Calibri" w:hAnsi="Calibri" w:eastAsia="Calibri" w:cs="Calibri"/>
+          <w:color w:val="333333"/>
+        </w:rPr>
+        <w:t>PECIALIZATIONS</w:t>
+      </w:r>
+      <w:r>
+        <w:rPr>
+          <w:rFonts w:ascii="Calibri" w:hAnsi="Calibri" w:eastAsia="Calibri" w:cs="Calibri"/>
+          <w:color w:val="333333"/>
+        </w:rPr>
+        <w:t>}</w:t>
       </w:r>
     </w:p>
     <w:p>
@@ -1052,22 +1310,22 @@
         <w:keepNext w:val="0"/>
         <w:keepLines w:val="0"/>
         <w:pBdr>
-          <w:bottom w:val="single" w:sz="6" w:space="2" w:color="000000"/>
+          <w:bottom w:val="single" w:color="000000" w:sz="6" w:space="2"/>
         </w:pBdr>
         <w:spacing w:before="220" w:after="80" w:line="240" w:lineRule="auto"/>
         <w:rPr>
-          <w:rFonts w:ascii="Calibri" w:eastAsia="Calibri" w:hAnsi="Calibri" w:cs="Calibri"/>
+          <w:rFonts w:ascii="Calibri" w:hAnsi="Calibri" w:eastAsia="Calibri" w:cs="Calibri"/>
           <w:b/>
           <w:bCs/>
           <w:sz w:val="22"/>
           <w:szCs w:val="22"/>
         </w:rPr>
       </w:pPr>
-      <w:bookmarkStart w:id="5" w:name="_o7v6giepxzwt" w:colFirst="0" w:colLast="0"/>
+      <w:bookmarkStart w:name="_o7v6giepxzwt" w:colFirst="0" w:colLast="0" w:id="5"/>
       <w:bookmarkEnd w:id="5"/>
       <w:r>
         <w:rPr>
-          <w:rFonts w:ascii="Calibri" w:eastAsia="Calibri" w:hAnsi="Calibri" w:cs="Calibri"/>
+          <w:rFonts w:ascii="Calibri" w:hAnsi="Calibri" w:eastAsia="Calibri" w:cs="Calibri"/>
           <w:b/>
           <w:bCs/>
           <w:sz w:val="22"/>
@@ -1078,22 +1336,41 @@
     </w:p>
     <w:p>
       <w:pPr>
-        <w:spacing w:before="180" w:after="180" w:line="240" w:lineRule="auto"/>
-        <w:rPr>
-          <w:rFonts w:ascii="Calibri" w:eastAsia="Calibri" w:hAnsi="Calibri" w:cs="Calibri"/>
-          <w:color w:val="333333"/>
-        </w:rPr>
-      </w:pPr>
-      <w:r>
-        <w:rPr>
-          <w:rFonts w:ascii="Calibri" w:eastAsia="Calibri" w:hAnsi="Calibri" w:cs="Calibri"/>
-          <w:color w:val="333333"/>
-        </w:rPr>
-        <w:t>{{Languages}}</w:t>
+        <w:pStyle w:val="Normal"/>
+        <w:suppressLineNumbers w:val="0"/>
+        <w:bidi w:val="0"/>
+        <w:spacing w:before="180" w:beforeAutospacing="off" w:after="180" w:afterAutospacing="off" w:line="240" w:lineRule="auto"/>
+        <w:ind w:left="0" w:right="0"/>
+        <w:jc w:val="left"/>
+        <w:rPr>
+          <w:rFonts w:ascii="Calibri" w:hAnsi="Calibri" w:eastAsia="Calibri" w:cs="Calibri"/>
+          <w:color w:val="333333"/>
+        </w:rPr>
+      </w:pPr>
+      <w:r>
+        <w:rPr>
+          <w:rFonts w:ascii="Calibri" w:hAnsi="Calibri" w:eastAsia="Calibri" w:cs="Calibri"/>
+          <w:color w:val="333333"/>
+        </w:rPr>
+        <w:t>{</w:t>
+      </w:r>
+      <w:r>
+        <w:rPr>
+          <w:rFonts w:ascii="Calibri" w:hAnsi="Calibri" w:eastAsia="Calibri" w:cs="Calibri"/>
+          <w:color w:val="333333"/>
+        </w:rPr>
+        <w:t>LANGUAGES</w:t>
+      </w:r>
+      <w:r>
+        <w:rPr>
+          <w:rFonts w:ascii="Calibri" w:hAnsi="Calibri" w:eastAsia="Calibri" w:cs="Calibri"/>
+          <w:color w:val="333333"/>
+        </w:rPr>
+        <w:t>}</w:t>
       </w:r>
     </w:p>
     <w:sectPr>
-      <w:pgSz w:w="12240" w:h="15840"/>
+      <w:pgSz w:w="12240" w:h="15840" w:orient="portrait"/>
       <w:pgMar w:top="0" w:right="450" w:bottom="180" w:left="450" w:header="720" w:footer="720" w:gutter="0"/>
       <w:pgNumType w:start="1"/>
       <w:cols w:space="720"/>
@@ -1692,7 +1969,7 @@
   <w:docDefaults>
     <w:rPrDefault>
       <w:rPr>
-        <w:rFonts w:ascii="Arial" w:eastAsia="Arial" w:hAnsi="Arial" w:cs="Arial"/>
+        <w:rFonts w:ascii="Arial" w:hAnsi="Arial" w:eastAsia="Arial" w:cs="Arial"/>
         <w:sz w:val="22"/>
         <w:szCs w:val="22"/>
         <w:lang w:eastAsia="en-US" w:bidi="ar-SA"/>
@@ -1705,8 +1982,8 @@
     </w:pPrDefault>
   </w:docDefaults>
   <w:latentStyles w:defLockedState="0" w:defUIPriority="99" w:defSemiHidden="1" w:defUnhideWhenUsed="1" w:defQFormat="0" w:count="267">
-    <w:lsdException w:name="Normal" w:semiHidden="0" w:uiPriority="0" w:unhideWhenUsed="0" w:qFormat="1"/>
-    <w:lsdException w:name="heading 1" w:semiHidden="0" w:uiPriority="9" w:unhideWhenUsed="0" w:qFormat="1"/>
+    <w:lsdException w:name="Normal" w:uiPriority="0" w:semiHidden="0" w:unhideWhenUsed="0" w:qFormat="1"/>
+    <w:lsdException w:name="heading 1" w:uiPriority="9" w:semiHidden="0" w:unhideWhenUsed="0" w:qFormat="1"/>
     <w:lsdException w:name="heading 2" w:uiPriority="9" w:qFormat="1"/>
     <w:lsdException w:name="heading 3" w:uiPriority="9" w:qFormat="1"/>
     <w:lsdException w:name="heading 4" w:uiPriority="9" w:qFormat="1"/>
@@ -1725,125 +2002,125 @@
     <w:lsdException w:name="toc 8" w:uiPriority="39"/>
     <w:lsdException w:name="toc 9" w:uiPriority="39"/>
     <w:lsdException w:name="caption" w:uiPriority="35" w:qFormat="1"/>
-    <w:lsdException w:name="Title" w:semiHidden="0" w:uiPriority="10" w:unhideWhenUsed="0" w:qFormat="1"/>
+    <w:lsdException w:name="Title" w:uiPriority="10" w:semiHidden="0" w:unhideWhenUsed="0" w:qFormat="1"/>
     <w:lsdException w:name="Default Paragraph Font" w:uiPriority="1"/>
-    <w:lsdException w:name="Subtitle" w:semiHidden="0" w:uiPriority="11" w:unhideWhenUsed="0" w:qFormat="1"/>
-    <w:lsdException w:name="Strong" w:semiHidden="0" w:uiPriority="22" w:unhideWhenUsed="0" w:qFormat="1"/>
-    <w:lsdException w:name="Emphasis" w:semiHidden="0" w:uiPriority="20" w:unhideWhenUsed="0" w:qFormat="1"/>
-    <w:lsdException w:name="Table Grid" w:semiHidden="0" w:uiPriority="59" w:unhideWhenUsed="0"/>
+    <w:lsdException w:name="Subtitle" w:uiPriority="11" w:semiHidden="0" w:unhideWhenUsed="0" w:qFormat="1"/>
+    <w:lsdException w:name="Strong" w:uiPriority="22" w:semiHidden="0" w:unhideWhenUsed="0" w:qFormat="1"/>
+    <w:lsdException w:name="Emphasis" w:uiPriority="20" w:semiHidden="0" w:unhideWhenUsed="0" w:qFormat="1"/>
+    <w:lsdException w:name="Table Grid" w:uiPriority="59" w:semiHidden="0" w:unhideWhenUsed="0"/>
     <w:lsdException w:name="Placeholder Text" w:unhideWhenUsed="0"/>
-    <w:lsdException w:name="No Spacing" w:semiHidden="0" w:uiPriority="1" w:unhideWhenUsed="0" w:qFormat="1"/>
-    <w:lsdException w:name="Light Shading" w:semiHidden="0" w:uiPriority="60" w:unhideWhenUsed="0"/>
-    <w:lsdException w:name="Light List" w:semiHidden="0" w:uiPriority="61" w:unhideWhenUsed="0"/>
-    <w:lsdException w:name="Light Grid" w:semiHidden="0" w:uiPriority="62" w:unhideWhenUsed="0"/>
-    <w:lsdException w:name="Medium Shading 1" w:semiHidden="0" w:uiPriority="63" w:unhideWhenUsed="0"/>
-    <w:lsdException w:name="Medium Shading 2" w:semiHidden="0" w:uiPriority="64" w:unhideWhenUsed="0"/>
-    <w:lsdException w:name="Medium List 1" w:semiHidden="0" w:uiPriority="65" w:unhideWhenUsed="0"/>
-    <w:lsdException w:name="Medium List 2" w:semiHidden="0" w:uiPriority="66" w:unhideWhenUsed="0"/>
-    <w:lsdException w:name="Medium Grid 1" w:semiHidden="0" w:uiPriority="67" w:unhideWhenUsed="0"/>
-    <w:lsdException w:name="Medium Grid 2" w:semiHidden="0" w:uiPriority="68" w:unhideWhenUsed="0"/>
-    <w:lsdException w:name="Medium Grid 3" w:semiHidden="0" w:uiPriority="69" w:unhideWhenUsed="0"/>
-    <w:lsdException w:name="Dark List" w:semiHidden="0" w:uiPriority="70" w:unhideWhenUsed="0"/>
-    <w:lsdException w:name="Colorful Shading" w:semiHidden="0" w:uiPriority="71" w:unhideWhenUsed="0"/>
-    <w:lsdException w:name="Colorful List" w:semiHidden="0" w:uiPriority="72" w:unhideWhenUsed="0"/>
-    <w:lsdException w:name="Colorful Grid" w:semiHidden="0" w:uiPriority="73" w:unhideWhenUsed="0"/>
-    <w:lsdException w:name="Light Shading Accent 1" w:semiHidden="0" w:uiPriority="60" w:unhideWhenUsed="0"/>
-    <w:lsdException w:name="Light List Accent 1" w:semiHidden="0" w:uiPriority="61" w:unhideWhenUsed="0"/>
-    <w:lsdException w:name="Light Grid Accent 1" w:semiHidden="0" w:uiPriority="62" w:unhideWhenUsed="0"/>
-    <w:lsdException w:name="Medium Shading 1 Accent 1" w:semiHidden="0" w:uiPriority="63" w:unhideWhenUsed="0"/>
-    <w:lsdException w:name="Medium Shading 2 Accent 1" w:semiHidden="0" w:uiPriority="64" w:unhideWhenUsed="0"/>
-    <w:lsdException w:name="Medium List 1 Accent 1" w:semiHidden="0" w:uiPriority="65" w:unhideWhenUsed="0"/>
+    <w:lsdException w:name="No Spacing" w:uiPriority="1" w:semiHidden="0" w:unhideWhenUsed="0" w:qFormat="1"/>
+    <w:lsdException w:name="Light Shading" w:uiPriority="60" w:semiHidden="0" w:unhideWhenUsed="0"/>
+    <w:lsdException w:name="Light List" w:uiPriority="61" w:semiHidden="0" w:unhideWhenUsed="0"/>
+    <w:lsdException w:name="Light Grid" w:uiPriority="62" w:semiHidden="0" w:unhideWhenUsed="0"/>
+    <w:lsdException w:name="Medium Shading 1" w:uiPriority="63" w:semiHidden="0" w:unhideWhenUsed="0"/>
+    <w:lsdException w:name="Medium Shading 2" w:uiPriority="64" w:semiHidden="0" w:unhideWhenUsed="0"/>
+    <w:lsdException w:name="Medium List 1" w:uiPriority="65" w:semiHidden="0" w:unhideWhenUsed="0"/>
+    <w:lsdException w:name="Medium List 2" w:uiPriority="66" w:semiHidden="0" w:unhideWhenUsed="0"/>
+    <w:lsdException w:name="Medium Grid 1" w:uiPriority="67" w:semiHidden="0" w:unhideWhenUsed="0"/>
+    <w:lsdException w:name="Medium Grid 2" w:uiPriority="68" w:semiHidden="0" w:unhideWhenUsed="0"/>
+    <w:lsdException w:name="Medium Grid 3" w:uiPriority="69" w:semiHidden="0" w:unhideWhenUsed="0"/>
+    <w:lsdException w:name="Dark List" w:uiPriority="70" w:semiHidden="0" w:unhideWhenUsed="0"/>
+    <w:lsdException w:name="Colorful Shading" w:uiPriority="71" w:semiHidden="0" w:unhideWhenUsed="0"/>
+    <w:lsdException w:name="Colorful List" w:uiPriority="72" w:semiHidden="0" w:unhideWhenUsed="0"/>
+    <w:lsdException w:name="Colorful Grid" w:uiPriority="73" w:semiHidden="0" w:unhideWhenUsed="0"/>
+    <w:lsdException w:name="Light Shading Accent 1" w:uiPriority="60" w:semiHidden="0" w:unhideWhenUsed="0"/>
+    <w:lsdException w:name="Light List Accent 1" w:uiPriority="61" w:semiHidden="0" w:unhideWhenUsed="0"/>
+    <w:lsdException w:name="Light Grid Accent 1" w:uiPriority="62" w:semiHidden="0" w:unhideWhenUsed="0"/>
+    <w:lsdException w:name="Medium Shading 1 Accent 1" w:uiPriority="63" w:semiHidden="0" w:unhideWhenUsed="0"/>
+    <w:lsdException w:name="Medium Shading 2 Accent 1" w:uiPriority="64" w:semiHidden="0" w:unhideWhenUsed="0"/>
+    <w:lsdException w:name="Medium List 1 Accent 1" w:uiPriority="65" w:semiHidden="0" w:unhideWhenUsed="0"/>
     <w:lsdException w:name="Revision" w:unhideWhenUsed="0"/>
-    <w:lsdException w:name="List Paragraph" w:semiHidden="0" w:uiPriority="34" w:unhideWhenUsed="0" w:qFormat="1"/>
-    <w:lsdException w:name="Quote" w:semiHidden="0" w:uiPriority="29" w:unhideWhenUsed="0" w:qFormat="1"/>
-    <w:lsdException w:name="Intense Quote" w:semiHidden="0" w:uiPriority="30" w:unhideWhenUsed="0" w:qFormat="1"/>
-    <w:lsdException w:name="Medium List 2 Accent 1" w:semiHidden="0" w:uiPriority="66" w:unhideWhenUsed="0"/>
-    <w:lsdException w:name="Medium Grid 1 Accent 1" w:semiHidden="0" w:uiPriority="67" w:unhideWhenUsed="0"/>
-    <w:lsdException w:name="Medium Grid 2 Accent 1" w:semiHidden="0" w:uiPriority="68" w:unhideWhenUsed="0"/>
-    <w:lsdException w:name="Medium Grid 3 Accent 1" w:semiHidden="0" w:uiPriority="69" w:unhideWhenUsed="0"/>
-    <w:lsdException w:name="Dark List Accent 1" w:semiHidden="0" w:uiPriority="70" w:unhideWhenUsed="0"/>
-    <w:lsdException w:name="Colorful Shading Accent 1" w:semiHidden="0" w:uiPriority="71" w:unhideWhenUsed="0"/>
-    <w:lsdException w:name="Colorful List Accent 1" w:semiHidden="0" w:uiPriority="72" w:unhideWhenUsed="0"/>
-    <w:lsdException w:name="Colorful Grid Accent 1" w:semiHidden="0" w:uiPriority="73" w:unhideWhenUsed="0"/>
-    <w:lsdException w:name="Light Shading Accent 2" w:semiHidden="0" w:uiPriority="60" w:unhideWhenUsed="0"/>
-    <w:lsdException w:name="Light List Accent 2" w:semiHidden="0" w:uiPriority="61" w:unhideWhenUsed="0"/>
-    <w:lsdException w:name="Light Grid Accent 2" w:semiHidden="0" w:uiPriority="62" w:unhideWhenUsed="0"/>
-    <w:lsdException w:name="Medium Shading 1 Accent 2" w:semiHidden="0" w:uiPriority="63" w:unhideWhenUsed="0"/>
-    <w:lsdException w:name="Medium Shading 2 Accent 2" w:semiHidden="0" w:uiPriority="64" w:unhideWhenUsed="0"/>
-    <w:lsdException w:name="Medium List 1 Accent 2" w:semiHidden="0" w:uiPriority="65" w:unhideWhenUsed="0"/>
-    <w:lsdException w:name="Medium List 2 Accent 2" w:semiHidden="0" w:uiPriority="66" w:unhideWhenUsed="0"/>
-    <w:lsdException w:name="Medium Grid 1 Accent 2" w:semiHidden="0" w:uiPriority="67" w:unhideWhenUsed="0"/>
-    <w:lsdException w:name="Medium Grid 2 Accent 2" w:semiHidden="0" w:uiPriority="68" w:unhideWhenUsed="0"/>
-    <w:lsdException w:name="Medium Grid 3 Accent 2" w:semiHidden="0" w:uiPriority="69" w:unhideWhenUsed="0"/>
-    <w:lsdException w:name="Dark List Accent 2" w:semiHidden="0" w:uiPriority="70" w:unhideWhenUsed="0"/>
-    <w:lsdException w:name="Colorful Shading Accent 2" w:semiHidden="0" w:uiPriority="71" w:unhideWhenUsed="0"/>
-    <w:lsdException w:name="Colorful List Accent 2" w:semiHidden="0" w:uiPriority="72" w:unhideWhenUsed="0"/>
-    <w:lsdException w:name="Colorful Grid Accent 2" w:semiHidden="0" w:uiPriority="73" w:unhideWhenUsed="0"/>
-    <w:lsdException w:name="Light Shading Accent 3" w:semiHidden="0" w:uiPriority="60" w:unhideWhenUsed="0"/>
-    <w:lsdException w:name="Light List Accent 3" w:semiHidden="0" w:uiPriority="61" w:unhideWhenUsed="0"/>
-    <w:lsdException w:name="Light Grid Accent 3" w:semiHidden="0" w:uiPriority="62" w:unhideWhenUsed="0"/>
-    <w:lsdException w:name="Medium Shading 1 Accent 3" w:semiHidden="0" w:uiPriority="63" w:unhideWhenUsed="0"/>
-    <w:lsdException w:name="Medium Shading 2 Accent 3" w:semiHidden="0" w:uiPriority="64" w:unhideWhenUsed="0"/>
-    <w:lsdException w:name="Medium List 1 Accent 3" w:semiHidden="0" w:uiPriority="65" w:unhideWhenUsed="0"/>
-    <w:lsdException w:name="Medium List 2 Accent 3" w:semiHidden="0" w:uiPriority="66" w:unhideWhenUsed="0"/>
-    <w:lsdException w:name="Medium Grid 1 Accent 3" w:semiHidden="0" w:uiPriority="67" w:unhideWhenUsed="0"/>
-    <w:lsdException w:name="Medium Grid 2 Accent 3" w:semiHidden="0" w:uiPriority="68" w:unhideWhenUsed="0"/>
-    <w:lsdException w:name="Medium Grid 3 Accent 3" w:semiHidden="0" w:uiPriority="69" w:unhideWhenUsed="0"/>
-    <w:lsdException w:name="Dark List Accent 3" w:semiHidden="0" w:uiPriority="70" w:unhideWhenUsed="0"/>
-    <w:lsdException w:name="Colorful Shading Accent 3" w:semiHidden="0" w:uiPriority="71" w:unhideWhenUsed="0"/>
-    <w:lsdException w:name="Colorful List Accent 3" w:semiHidden="0" w:uiPriority="72" w:unhideWhenUsed="0"/>
-    <w:lsdException w:name="Colorful Grid Accent 3" w:semiHidden="0" w:uiPriority="73" w:unhideWhenUsed="0"/>
-    <w:lsdException w:name="Light Shading Accent 4" w:semiHidden="0" w:uiPriority="60" w:unhideWhenUsed="0"/>
-    <w:lsdException w:name="Light List Accent 4" w:semiHidden="0" w:uiPriority="61" w:unhideWhenUsed="0"/>
-    <w:lsdException w:name="Light Grid Accent 4" w:semiHidden="0" w:uiPriority="62" w:unhideWhenUsed="0"/>
-    <w:lsdException w:name="Medium Shading 1 Accent 4" w:semiHidden="0" w:uiPriority="63" w:unhideWhenUsed="0"/>
-    <w:lsdException w:name="Medium Shading 2 Accent 4" w:semiHidden="0" w:uiPriority="64" w:unhideWhenUsed="0"/>
-    <w:lsdException w:name="Medium List 1 Accent 4" w:semiHidden="0" w:uiPriority="65" w:unhideWhenUsed="0"/>
-    <w:lsdException w:name="Medium List 2 Accent 4" w:semiHidden="0" w:uiPriority="66" w:unhideWhenUsed="0"/>
-    <w:lsdException w:name="Medium Grid 1 Accent 4" w:semiHidden="0" w:uiPriority="67" w:unhideWhenUsed="0"/>
-    <w:lsdException w:name="Medium Grid 2 Accent 4" w:semiHidden="0" w:uiPriority="68" w:unhideWhenUsed="0"/>
-    <w:lsdException w:name="Medium Grid 3 Accent 4" w:semiHidden="0" w:uiPriority="69" w:unhideWhenUsed="0"/>
-    <w:lsdException w:name="Dark List Accent 4" w:semiHidden="0" w:uiPriority="70" w:unhideWhenUsed="0"/>
-    <w:lsdException w:name="Colorful Shading Accent 4" w:semiHidden="0" w:uiPriority="71" w:unhideWhenUsed="0"/>
-    <w:lsdException w:name="Colorful List Accent 4" w:semiHidden="0" w:uiPriority="72" w:unhideWhenUsed="0"/>
-    <w:lsdException w:name="Colorful Grid Accent 4" w:semiHidden="0" w:uiPriority="73" w:unhideWhenUsed="0"/>
-    <w:lsdException w:name="Light Shading Accent 5" w:semiHidden="0" w:uiPriority="60" w:unhideWhenUsed="0"/>
-    <w:lsdException w:name="Light List Accent 5" w:semiHidden="0" w:uiPriority="61" w:unhideWhenUsed="0"/>
-    <w:lsdException w:name="Light Grid Accent 5" w:semiHidden="0" w:uiPriority="62" w:unhideWhenUsed="0"/>
-    <w:lsdException w:name="Medium Shading 1 Accent 5" w:semiHidden="0" w:uiPriority="63" w:unhideWhenUsed="0"/>
-    <w:lsdException w:name="Medium Shading 2 Accent 5" w:semiHidden="0" w:uiPriority="64" w:unhideWhenUsed="0"/>
-    <w:lsdException w:name="Medium List 1 Accent 5" w:semiHidden="0" w:uiPriority="65" w:unhideWhenUsed="0"/>
-    <w:lsdException w:name="Medium List 2 Accent 5" w:semiHidden="0" w:uiPriority="66" w:unhideWhenUsed="0"/>
-    <w:lsdException w:name="Medium Grid 1 Accent 5" w:semiHidden="0" w:uiPriority="67" w:unhideWhenUsed="0"/>
-    <w:lsdException w:name="Medium Grid 2 Accent 5" w:semiHidden="0" w:uiPriority="68" w:unhideWhenUsed="0"/>
-    <w:lsdException w:name="Medium Grid 3 Accent 5" w:semiHidden="0" w:uiPriority="69" w:unhideWhenUsed="0"/>
-    <w:lsdException w:name="Dark List Accent 5" w:semiHidden="0" w:uiPriority="70" w:unhideWhenUsed="0"/>
-    <w:lsdException w:name="Colorful Shading Accent 5" w:semiHidden="0" w:uiPriority="71" w:unhideWhenUsed="0"/>
-    <w:lsdException w:name="Colorful List Accent 5" w:semiHidden="0" w:uiPriority="72" w:unhideWhenUsed="0"/>
-    <w:lsdException w:name="Colorful Grid Accent 5" w:semiHidden="0" w:uiPriority="73" w:unhideWhenUsed="0"/>
-    <w:lsdException w:name="Light Shading Accent 6" w:semiHidden="0" w:uiPriority="60" w:unhideWhenUsed="0"/>
-    <w:lsdException w:name="Light List Accent 6" w:semiHidden="0" w:uiPriority="61" w:unhideWhenUsed="0"/>
-    <w:lsdException w:name="Light Grid Accent 6" w:semiHidden="0" w:uiPriority="62" w:unhideWhenUsed="0"/>
-    <w:lsdException w:name="Medium Shading 1 Accent 6" w:semiHidden="0" w:uiPriority="63" w:unhideWhenUsed="0"/>
-    <w:lsdException w:name="Medium Shading 2 Accent 6" w:semiHidden="0" w:uiPriority="64" w:unhideWhenUsed="0"/>
-    <w:lsdException w:name="Medium List 1 Accent 6" w:semiHidden="0" w:uiPriority="65" w:unhideWhenUsed="0"/>
-    <w:lsdException w:name="Medium List 2 Accent 6" w:semiHidden="0" w:uiPriority="66" w:unhideWhenUsed="0"/>
-    <w:lsdException w:name="Medium Grid 1 Accent 6" w:semiHidden="0" w:uiPriority="67" w:unhideWhenUsed="0"/>
-    <w:lsdException w:name="Medium Grid 2 Accent 6" w:semiHidden="0" w:uiPriority="68" w:unhideWhenUsed="0"/>
-    <w:lsdException w:name="Medium Grid 3 Accent 6" w:semiHidden="0" w:uiPriority="69" w:unhideWhenUsed="0"/>
-    <w:lsdException w:name="Dark List Accent 6" w:semiHidden="0" w:uiPriority="70" w:unhideWhenUsed="0"/>
-    <w:lsdException w:name="Colorful Shading Accent 6" w:semiHidden="0" w:uiPriority="71" w:unhideWhenUsed="0"/>
-    <w:lsdException w:name="Colorful List Accent 6" w:semiHidden="0" w:uiPriority="72" w:unhideWhenUsed="0"/>
-    <w:lsdException w:name="Colorful Grid Accent 6" w:semiHidden="0" w:uiPriority="73" w:unhideWhenUsed="0"/>
-    <w:lsdException w:name="Subtle Emphasis" w:semiHidden="0" w:uiPriority="19" w:unhideWhenUsed="0" w:qFormat="1"/>
-    <w:lsdException w:name="Intense Emphasis" w:semiHidden="0" w:uiPriority="21" w:unhideWhenUsed="0" w:qFormat="1"/>
-    <w:lsdException w:name="Subtle Reference" w:semiHidden="0" w:uiPriority="31" w:unhideWhenUsed="0" w:qFormat="1"/>
-    <w:lsdException w:name="Intense Reference" w:semiHidden="0" w:uiPriority="32" w:unhideWhenUsed="0" w:qFormat="1"/>
-    <w:lsdException w:name="Book Title" w:semiHidden="0" w:uiPriority="33" w:unhideWhenUsed="0" w:qFormat="1"/>
+    <w:lsdException w:name="List Paragraph" w:uiPriority="34" w:semiHidden="0" w:unhideWhenUsed="0" w:qFormat="1"/>
+    <w:lsdException w:name="Quote" w:uiPriority="29" w:semiHidden="0" w:unhideWhenUsed="0" w:qFormat="1"/>
+    <w:lsdException w:name="Intense Quote" w:uiPriority="30" w:semiHidden="0" w:unhideWhenUsed="0" w:qFormat="1"/>
+    <w:lsdException w:name="Medium List 2 Accent 1" w:uiPriority="66" w:semiHidden="0" w:unhideWhenUsed="0"/>
+    <w:lsdException w:name="Medium Grid 1 Accent 1" w:uiPriority="67" w:semiHidden="0" w:unhideWhenUsed="0"/>
+    <w:lsdException w:name="Medium Grid 2 Accent 1" w:uiPriority="68" w:semiHidden="0" w:unhideWhenUsed="0"/>
+    <w:lsdException w:name="Medium Grid 3 Accent 1" w:uiPriority="69" w:semiHidden="0" w:unhideWhenUsed="0"/>
+    <w:lsdException w:name="Dark List Accent 1" w:uiPriority="70" w:semiHidden="0" w:unhideWhenUsed="0"/>
+    <w:lsdException w:name="Colorful Shading Accent 1" w:uiPriority="71" w:semiHidden="0" w:unhideWhenUsed="0"/>
+    <w:lsdException w:name="Colorful List Accent 1" w:uiPriority="72" w:semiHidden="0" w:unhideWhenUsed="0"/>
+    <w:lsdException w:name="Colorful Grid Accent 1" w:uiPriority="73" w:semiHidden="0" w:unhideWhenUsed="0"/>
+    <w:lsdException w:name="Light Shading Accent 2" w:uiPriority="60" w:semiHidden="0" w:unhideWhenUsed="0"/>
+    <w:lsdException w:name="Light List Accent 2" w:uiPriority="61" w:semiHidden="0" w:unhideWhenUsed="0"/>
+    <w:lsdException w:name="Light Grid Accent 2" w:uiPriority="62" w:semiHidden="0" w:unhideWhenUsed="0"/>
+    <w:lsdException w:name="Medium Shading 1 Accent 2" w:uiPriority="63" w:semiHidden="0" w:unhideWhenUsed="0"/>
+    <w:lsdException w:name="Medium Shading 2 Accent 2" w:uiPriority="64" w:semiHidden="0" w:unhideWhenUsed="0"/>
+    <w:lsdException w:name="Medium List 1 Accent 2" w:uiPriority="65" w:semiHidden="0" w:unhideWhenUsed="0"/>
+    <w:lsdException w:name="Medium List 2 Accent 2" w:uiPriority="66" w:semiHidden="0" w:unhideWhenUsed="0"/>
+    <w:lsdException w:name="Medium Grid 1 Accent 2" w:uiPriority="67" w:semiHidden="0" w:unhideWhenUsed="0"/>
+    <w:lsdException w:name="Medium Grid 2 Accent 2" w:uiPriority="68" w:semiHidden="0" w:unhideWhenUsed="0"/>
+    <w:lsdException w:name="Medium Grid 3 Accent 2" w:uiPriority="69" w:semiHidden="0" w:unhideWhenUsed="0"/>
+    <w:lsdException w:name="Dark List Accent 2" w:uiPriority="70" w:semiHidden="0" w:unhideWhenUsed="0"/>
+    <w:lsdException w:name="Colorful Shading Accent 2" w:uiPriority="71" w:semiHidden="0" w:unhideWhenUsed="0"/>
+    <w:lsdException w:name="Colorful List Accent 2" w:uiPriority="72" w:semiHidden="0" w:unhideWhenUsed="0"/>
+    <w:lsdException w:name="Colorful Grid Accent 2" w:uiPriority="73" w:semiHidden="0" w:unhideWhenUsed="0"/>
+    <w:lsdException w:name="Light Shading Accent 3" w:uiPriority="60" w:semiHidden="0" w:unhideWhenUsed="0"/>
+    <w:lsdException w:name="Light List Accent 3" w:uiPriority="61" w:semiHidden="0" w:unhideWhenUsed="0"/>
+    <w:lsdException w:name="Light Grid Accent 3" w:uiPriority="62" w:semiHidden="0" w:unhideWhenUsed="0"/>
+    <w:lsdException w:name="Medium Shading 1 Accent 3" w:uiPriority="63" w:semiHidden="0" w:unhideWhenUsed="0"/>
+    <w:lsdException w:name="Medium Shading 2 Accent 3" w:uiPriority="64" w:semiHidden="0" w:unhideWhenUsed="0"/>
+    <w:lsdException w:name="Medium List 1 Accent 3" w:uiPriority="65" w:semiHidden="0" w:unhideWhenUsed="0"/>
+    <w:lsdException w:name="Medium List 2 Accent 3" w:uiPriority="66" w:semiHidden="0" w:unhideWhenUsed="0"/>
+    <w:lsdException w:name="Medium Grid 1 Accent 3" w:uiPriority="67" w:semiHidden="0" w:unhideWhenUsed="0"/>
+    <w:lsdException w:name="Medium Grid 2 Accent 3" w:uiPriority="68" w:semiHidden="0" w:unhideWhenUsed="0"/>
+    <w:lsdException w:name="Medium Grid 3 Accent 3" w:uiPriority="69" w:semiHidden="0" w:unhideWhenUsed="0"/>
+    <w:lsdException w:name="Dark List Accent 3" w:uiPriority="70" w:semiHidden="0" w:unhideWhenUsed="0"/>
+    <w:lsdException w:name="Colorful Shading Accent 3" w:uiPriority="71" w:semiHidden="0" w:unhideWhenUsed="0"/>
+    <w:lsdException w:name="Colorful List Accent 3" w:uiPriority="72" w:semiHidden="0" w:unhideWhenUsed="0"/>
+    <w:lsdException w:name="Colorful Grid Accent 3" w:uiPriority="73" w:semiHidden="0" w:unhideWhenUsed="0"/>
+    <w:lsdException w:name="Light Shading Accent 4" w:uiPriority="60" w:semiHidden="0" w:unhideWhenUsed="0"/>
+    <w:lsdException w:name="Light List Accent 4" w:uiPriority="61" w:semiHidden="0" w:unhideWhenUsed="0"/>
+    <w:lsdException w:name="Light Grid Accent 4" w:uiPriority="62" w:semiHidden="0" w:unhideWhenUsed="0"/>
+    <w:lsdException w:name="Medium Shading 1 Accent 4" w:uiPriority="63" w:semiHidden="0" w:unhideWhenUsed="0"/>
+    <w:lsdException w:name="Medium Shading 2 Accent 4" w:uiPriority="64" w:semiHidden="0" w:unhideWhenUsed="0"/>
+    <w:lsdException w:name="Medium List 1 Accent 4" w:uiPriority="65" w:semiHidden="0" w:unhideWhenUsed="0"/>
+    <w:lsdException w:name="Medium List 2 Accent 4" w:uiPriority="66" w:semiHidden="0" w:unhideWhenUsed="0"/>
+    <w:lsdException w:name="Medium Grid 1 Accent 4" w:uiPriority="67" w:semiHidden="0" w:unhideWhenUsed="0"/>
+    <w:lsdException w:name="Medium Grid 2 Accent 4" w:uiPriority="68" w:semiHidden="0" w:unhideWhenUsed="0"/>
+    <w:lsdException w:name="Medium Grid 3 Accent 4" w:uiPriority="69" w:semiHidden="0" w:unhideWhenUsed="0"/>
+    <w:lsdException w:name="Dark List Accent 4" w:uiPriority="70" w:semiHidden="0" w:unhideWhenUsed="0"/>
+    <w:lsdException w:name="Colorful Shading Accent 4" w:uiPriority="71" w:semiHidden="0" w:unhideWhenUsed="0"/>
+    <w:lsdException w:name="Colorful List Accent 4" w:uiPriority="72" w:semiHidden="0" w:unhideWhenUsed="0"/>
+    <w:lsdException w:name="Colorful Grid Accent 4" w:uiPriority="73" w:semiHidden="0" w:unhideWhenUsed="0"/>
+    <w:lsdException w:name="Light Shading Accent 5" w:uiPriority="60" w:semiHidden="0" w:unhideWhenUsed="0"/>
+    <w:lsdException w:name="Light List Accent 5" w:uiPriority="61" w:semiHidden="0" w:unhideWhenUsed="0"/>
+    <w:lsdException w:name="Light Grid Accent 5" w:uiPriority="62" w:semiHidden="0" w:unhideWhenUsed="0"/>
+    <w:lsdException w:name="Medium Shading 1 Accent 5" w:uiPriority="63" w:semiHidden="0" w:unhideWhenUsed="0"/>
+    <w:lsdException w:name="Medium Shading 2 Accent 5" w:uiPriority="64" w:semiHidden="0" w:unhideWhenUsed="0"/>
+    <w:lsdException w:name="Medium List 1 Accent 5" w:uiPriority="65" w:semiHidden="0" w:unhideWhenUsed="0"/>
+    <w:lsdException w:name="Medium List 2 Accent 5" w:uiPriority="66" w:semiHidden="0" w:unhideWhenUsed="0"/>
+    <w:lsdException w:name="Medium Grid 1 Accent 5" w:uiPriority="67" w:semiHidden="0" w:unhideWhenUsed="0"/>
+    <w:lsdException w:name="Medium Grid 2 Accent 5" w:uiPriority="68" w:semiHidden="0" w:unhideWhenUsed="0"/>
+    <w:lsdException w:name="Medium Grid 3 Accent 5" w:uiPriority="69" w:semiHidden="0" w:unhideWhenUsed="0"/>
+    <w:lsdException w:name="Dark List Accent 5" w:uiPriority="70" w:semiHidden="0" w:unhideWhenUsed="0"/>
+    <w:lsdException w:name="Colorful Shading Accent 5" w:uiPriority="71" w:semiHidden="0" w:unhideWhenUsed="0"/>
+    <w:lsdException w:name="Colorful List Accent 5" w:uiPriority="72" w:semiHidden="0" w:unhideWhenUsed="0"/>
+    <w:lsdException w:name="Colorful Grid Accent 5" w:uiPriority="73" w:semiHidden="0" w:unhideWhenUsed="0"/>
+    <w:lsdException w:name="Light Shading Accent 6" w:uiPriority="60" w:semiHidden="0" w:unhideWhenUsed="0"/>
+    <w:lsdException w:name="Light List Accent 6" w:uiPriority="61" w:semiHidden="0" w:unhideWhenUsed="0"/>
+    <w:lsdException w:name="Light Grid Accent 6" w:uiPriority="62" w:semiHidden="0" w:unhideWhenUsed="0"/>
+    <w:lsdException w:name="Medium Shading 1 Accent 6" w:uiPriority="63" w:semiHidden="0" w:unhideWhenUsed="0"/>
+    <w:lsdException w:name="Medium Shading 2 Accent 6" w:uiPriority="64" w:semiHidden="0" w:unhideWhenUsed="0"/>
+    <w:lsdException w:name="Medium List 1 Accent 6" w:uiPriority="65" w:semiHidden="0" w:unhideWhenUsed="0"/>
+    <w:lsdException w:name="Medium List 2 Accent 6" w:uiPriority="66" w:semiHidden="0" w:unhideWhenUsed="0"/>
+    <w:lsdException w:name="Medium Grid 1 Accent 6" w:uiPriority="67" w:semiHidden="0" w:unhideWhenUsed="0"/>
+    <w:lsdException w:name="Medium Grid 2 Accent 6" w:uiPriority="68" w:semiHidden="0" w:unhideWhenUsed="0"/>
+    <w:lsdException w:name="Medium Grid 3 Accent 6" w:uiPriority="69" w:semiHidden="0" w:unhideWhenUsed="0"/>
+    <w:lsdException w:name="Dark List Accent 6" w:uiPriority="70" w:semiHidden="0" w:unhideWhenUsed="0"/>
+    <w:lsdException w:name="Colorful Shading Accent 6" w:uiPriority="71" w:semiHidden="0" w:unhideWhenUsed="0"/>
+    <w:lsdException w:name="Colorful List Accent 6" w:uiPriority="72" w:semiHidden="0" w:unhideWhenUsed="0"/>
+    <w:lsdException w:name="Colorful Grid Accent 6" w:uiPriority="73" w:semiHidden="0" w:unhideWhenUsed="0"/>
+    <w:lsdException w:name="Subtle Emphasis" w:uiPriority="19" w:semiHidden="0" w:unhideWhenUsed="0" w:qFormat="1"/>
+    <w:lsdException w:name="Intense Emphasis" w:uiPriority="21" w:semiHidden="0" w:unhideWhenUsed="0" w:qFormat="1"/>
+    <w:lsdException w:name="Subtle Reference" w:uiPriority="31" w:semiHidden="0" w:unhideWhenUsed="0" w:qFormat="1"/>
+    <w:lsdException w:name="Intense Reference" w:uiPriority="32" w:semiHidden="0" w:unhideWhenUsed="0" w:qFormat="1"/>
+    <w:lsdException w:name="Book Title" w:uiPriority="33" w:semiHidden="0" w:unhideWhenUsed="0" w:qFormat="1"/>
     <w:lsdException w:name="Bibliography" w:uiPriority="37"/>
     <w:lsdException w:name="TOC Heading" w:uiPriority="39" w:qFormat="1"/>
   </w:latentStyles>
-  <w:style w:type="paragraph" w:default="1" w:styleId="Normal">
+  <w:style w:type="paragraph" w:styleId="Normal" w:default="1">
     <w:name w:val="Normal"/>
     <w:rsid w:val="00A54020"/>
   </w:style>
@@ -1939,13 +2216,13 @@
       <w:color w:val="666666"/>
     </w:rPr>
   </w:style>
-  <w:style w:type="character" w:default="1" w:styleId="DefaultParagraphFont">
+  <w:style w:type="character" w:styleId="DefaultParagraphFont" w:default="1">
     <w:name w:val="Default Paragraph Font"/>
     <w:uiPriority w:val="1"/>
     <w:semiHidden/>
     <w:unhideWhenUsed/>
   </w:style>
-  <w:style w:type="table" w:default="1" w:styleId="TableNormal">
+  <w:style w:type="table" w:styleId="TableNormal" w:default="1">
     <w:name w:val="Normal Table"/>
     <w:uiPriority w:val="99"/>
     <w:semiHidden/>
@@ -1960,13 +2237,13 @@
       </w:tblCellMar>
     </w:tblPr>
   </w:style>
-  <w:style w:type="numbering" w:default="1" w:styleId="NoList">
+  <w:style w:type="numbering" w:styleId="NoList" w:default="1">
     <w:name w:val="No List"/>
     <w:uiPriority w:val="99"/>
     <w:semiHidden/>
     <w:unhideWhenUsed/>
   </w:style>
-  <w:style w:type="table" w:customStyle="1" w:styleId="TableNormal0">
+  <w:style w:type="table" w:styleId="TableNormal0" w:customStyle="1">
     <w:name w:val="TableNormal"/>
     <w:tblPr>
       <w:tblCellMar>

</xml_diff>